<commit_message>
Add equations and prediction figure to COSYNE abstract
Revise the anonymous two-page submission with two native Word equations, a decoder prediction figure and caption, and compact author-year-only references.

Co-authored-by: Copilot <223556219+Copilot@users.noreply.github.com>
</commit_message>
<xml_diff>
--- a/presentation/poster/COSYNE_2027_Poster_Abstract.docx
+++ b/presentation/poster/COSYNE_2027_Poster_Abstract.docx
@@ -5,7 +5,7 @@
     <w:p>
       <w:pPr>
         <w:keepNext/>
-        <w:spacing w:after="160"/>
+        <w:spacing w:after="120"/>
         <w:jc w:val="center"/>
       </w:pPr>
       <w:r>
@@ -20,7 +20,7 @@
     <w:p>
       <w:pPr>
         <w:keepNext/>
-        <w:spacing w:before="80" w:after="60"/>
+        <w:spacing w:before="60" w:after="40"/>
       </w:pPr>
       <w:r>
         <w:rPr>
@@ -33,7 +33,7 @@
     </w:p>
     <w:p>
       <w:pPr>
-        <w:spacing w:after="140"/>
+        <w:spacing w:after="100"/>
       </w:pPr>
       <w:r>
         <w:t>Motor systems must adjust ongoing actions when unexpected forces occur, yet continue toward a goal and respect physical constraints. How can a learned controller organize such corrections when obstacles narrow the available route? We asked whether reward-based training alone can produce structured obstacle avoidance and whether the resulting activity offers an organizational comparison with biological motor control. We trained a proximal policy optimization (PPO) controller to move a point mass through a corridor with two obstacles. Its feedforward multilayer perceptron (MLP) actor had two 256-unit hidden layers. We analyzed the activity of a 256-unit hidden-unit population using principal component analysis (PCA), clustering, kinematic tuning, linear decoding, and closed-loop dynamical analysis of the policy coupled to the physics. Moderate lateral perturbations produced path changes under 0.1 m while the controller continued toward the goal. The first two principal components explained 71% of activity variance; activity followed phase-ordered routes shared across perturbation conditions and separated by detour. At the obstacle band, the closed loop had two stable lateral fixed points, one per route (x*=3.32 m and 6.71 m), with similar relaxation times (1.42 s and 1.34 s) and clearances (0.43 m and 0.46 m). These results show that reward learning can yield structured, locally stabilizing routes in this model. The resemblance to biological reaching is organizational, not evidence of neural equivalence; results are from one training seed.</w:t>
@@ -42,7 +42,7 @@
     <w:p>
       <w:pPr>
         <w:keepNext/>
-        <w:spacing w:before="80" w:after="60"/>
+        <w:spacing w:before="60" w:after="40"/>
       </w:pPr>
       <w:r>
         <w:rPr>
@@ -55,16 +55,16 @@
     </w:p>
     <w:p>
       <w:pPr>
-        <w:spacing w:after="100"/>
+        <w:spacing w:after="80"/>
       </w:pPr>
       <w:r>
-        <w:t>Success at reaching a target does not reveal how feedback corrects movement after an unexpected force. The correction must preserve progress toward the goal while respecting the obstacle boundary. We therefore examined route structure and population activity, not only task success. ?Population? here means the 256 artificial units in one hidden layer?not neurons recorded from an animal. The feedforward actor processes each observation independently and has no recurrent memory. Accordingly, the fixed points are not equilibria of recurrent hidden activity [2]; they are fixed points of the complete policy?environment closed loop.</w:t>
+        <w:t>Success at reaching a target does not reveal how feedback corrects movement after an unexpected force. The correction must preserve progress toward the goal while respecting the obstacle boundary. We therefore examined route structure and population activity, not only task success. Here, "population" means the 256 artificial units in one hidden layer, not neurons recorded from an animal. The feedforward actor processes each observation independently and has no recurrent memory. Accordingly, the fixed points are not equilibria of recurrent hidden activity (Sussillo &amp; Barak, 2013); they are fixed points of the complete policy-environment closed loop.</w:t>
       </w:r>
     </w:p>
     <w:p>
       <w:pPr>
         <w:keepNext/>
-        <w:spacing w:before="80" w:after="60"/>
+        <w:spacing w:before="60" w:after="40"/>
       </w:pPr>
       <w:r>
         <w:rPr>
@@ -80,103 +80,13 @@
         <w:spacing w:after="0"/>
       </w:pPr>
       <w:r>
-        <w:t>A proximal policy optimization actor?critic was trained for 3 million environment steps. The actor was a feedforward multilayer perceptron with two 256-unit hidden layers and selected an action from the current state at each timestep. We evaluated a baseline and six perturbation conditions: lateral force impulses in three magnitudes to the left or right, each lasting 14 timesteps. We analyzed activity from a 256-unit hidden layer using principal component analysis, clustering, kinematic tuning, and linear decoding. These analyses characterize activity by movement phase and route and test how much movement information can be read from the population.</w:t>
-      </w:r>
-    </w:p>
-    <w:p>
-      <w:r>
-        <w:br w:type="page"/>
+        <w:t>A proximal policy optimization actor-critic was trained for 3 million environment steps. The actor was a feedforward multilayer perceptron with two 256-unit hidden layers and selected an action from the current state at each timestep. We evaluated a baseline and six perturbation conditions: lateral force impulses in three magnitudes to the left or right, each lasting 14 timesteps. We analyzed activity from a 256-unit hidden layer using principal component analysis, clustering, kinematic tuning, and linear decoding. These analyses characterize activity by movement phase and route and test how much movement information can be read from the population. Motor-cortex recordings motivate this population-level comparison (Churchland et al., 2012).</w:t>
       </w:r>
     </w:p>
     <w:p>
       <w:pPr>
         <w:keepNext/>
-        <w:spacing w:before="80" w:after="60"/>
-      </w:pPr>
-      <w:r>
-        <w:rPr>
-          <w:rFonts w:ascii="Arial" w:hAnsi="Arial" w:eastAsia="Arial"/>
-          <w:b/>
-          <w:sz w:val="24"/>
-        </w:rPr>
-        <w:t>Additional detail: closed-loop results and biological scope</w:t>
-      </w:r>
-    </w:p>
-    <w:p>
-      <w:pPr>
-        <w:spacing w:after="80"/>
-      </w:pPr>
-      <w:r>
-        <w:t>The first two principal components explained 40% and 31% of activity variance. At y = 5 m, the obstacle band, each route had one zero crossing in commanded lateral acceleration with a negative slope, consistent with local restoring behavior. Linearization gave real eigenvalues of magnitude below 1 for both routes, indicating stable, nonoscillatory fixed points at x*=3.32 m and 6.71 m. The points were within 0.11 m of observed completed-episode crossings. The two obstacles were centered at x=4.25 m and x=5.75 m, each with a 0.5 m radius; route clearances were 0.43 m and 0.46 m. Relaxation times (1.42 s and 1.34 s) describe local return in the model, not human response latency. Biological reaching also shows graded corrections to unexpected forces while movement continues, supported by coordinated muscle activity [1, 3, 4]. This is an organizational comparison, not evidence of neural or muscular equivalence. Results are from one training seed; fixed points vary across checkpoints. Multi-seed training and planned wrist-kinematic and six-muscle surface electromyography (EMG) comparisons in healthy adults and stroke survivors will test robustness and biological scope.</w:t>
-      </w:r>
-    </w:p>
-    <w:p>
-      <w:pPr>
-        <w:keepNext/>
-        <w:spacing w:after="40"/>
-        <w:jc w:val="center"/>
-      </w:pPr>
-      <w:r>
-        <w:drawing>
-          <wp:inline xmlns:a="http://schemas.openxmlformats.org/drawingml/2006/main" xmlns:pic="http://schemas.openxmlformats.org/drawingml/2006/picture">
-            <wp:extent cx="3429000" cy="3991708"/>
-            <wp:docPr id="1" name="Picture 1"/>
-            <wp:cNvGraphicFramePr>
-              <a:graphicFrameLocks noChangeAspect="1"/>
-            </wp:cNvGraphicFramePr>
-            <a:graphic>
-              <a:graphicData uri="http://schemas.openxmlformats.org/drawingml/2006/picture">
-                <pic:pic>
-                  <pic:nvPicPr>
-                    <pic:cNvPr id="0" name="fig_composite_obstacle_avoidance_mechanism.png"/>
-                    <pic:cNvPicPr/>
-                  </pic:nvPicPr>
-                  <pic:blipFill>
-                    <a:blip r:embed="rId9"/>
-                    <a:stretch>
-                      <a:fillRect/>
-                    </a:stretch>
-                  </pic:blipFill>
-                  <pic:spPr>
-                    <a:xfrm>
-                      <a:off x="0" y="0"/>
-                      <a:ext cx="3429000" cy="3991708"/>
-                    </a:xfrm>
-                    <a:prstGeom prst="rect"/>
-                  </pic:spPr>
-                </pic:pic>
-              </a:graphicData>
-            </a:graphic>
-          </wp:inline>
-        </w:drawing>
-      </w:r>
-    </w:p>
-    <w:p>
-      <w:pPr>
-        <w:keepNext/>
-        <w:spacing w:after="60"/>
-      </w:pPr>
-      <w:r>
-        <w:rPr>
-          <w:rFonts w:ascii="Arial" w:hAnsi="Arial" w:eastAsia="Arial"/>
-          <w:b/>
-          <w:sz w:val="20"/>
-        </w:rPr>
-        <w:t xml:space="preserve">Figure 1. </w:t>
-      </w:r>
-      <w:r>
-        <w:rPr>
-          <w:rFonts w:ascii="Arial" w:hAnsi="Arial" w:eastAsia="Arial"/>
-          <w:b w:val="0"/>
-          <w:sz w:val="20"/>
-        </w:rPr>
-        <w:t>Obstacle avoidance and its closed-loop organization. (I) Baseline and six perturbation trajectories; crosses indicate collisions, observed only for the strongest rightward impulse on the left route; stars mark fixed points at y = 5 m. (II) Hidden-layer activity projected onto PC1?PC2 and colored by step, with fixed-point routes. (III) Commanded lateral acceleration at y = 5 m; each route has a zero crossing with negative slope. Ticks mark completed-episode crossings of the obstacle band.</w:t>
-      </w:r>
-    </w:p>
-    <w:p>
-      <w:pPr>
-        <w:keepNext/>
-        <w:spacing w:before="80" w:after="60"/>
+        <w:spacing w:before="60" w:after="40"/>
       </w:pPr>
       <w:r>
         <w:rPr>
@@ -193,55 +103,406 @@
       </w:pPr>
       <w:r>
         <w:rPr>
-          <w:rFonts w:ascii="Arial" w:hAnsi="Arial" w:eastAsia="Arial"/>
-          <w:b w:val="0"/>
-          <w:sz w:val="20"/>
+          <w:rFonts w:ascii="Arial" w:hAnsi="Arial"/>
+          <w:sz w:val="18"/>
         </w:rPr>
-        <w:t>[1] Churchland, M. M. et al. (2012). Neural population dynamics during reaching. Nature, 487, 51?56.</w:t>
+        <w:t>Churchland et al. (2012); Sussillo &amp; Barak (2013); Pruszynski &amp; Scott (2012); Nashed et al. (2014).</w:t>
+      </w:r>
+    </w:p>
+    <w:p>
+      <w:r>
+        <w:br w:type="page"/>
       </w:r>
     </w:p>
     <w:p>
       <w:pPr>
-        <w:spacing w:after="0" w:line="240" w:lineRule="auto"/>
+        <w:keepNext/>
+        <w:spacing w:before="60" w:after="40"/>
       </w:pPr>
       <w:r>
         <w:rPr>
           <w:rFonts w:ascii="Arial" w:hAnsi="Arial" w:eastAsia="Arial"/>
-          <w:b w:val="0"/>
-          <w:sz w:val="20"/>
+          <w:b/>
+          <w:sz w:val="24"/>
         </w:rPr>
-        <w:t>[2] Sussillo, D. &amp; Barak, O. (2013). Opening the black box: Low-dimensional dynamics in high-dimensional recurrent neural networks. Neural Computation, 25, 626?649.</w:t>
+        <w:t>Additional detail: closed-loop mechanism and population readout</w:t>
       </w:r>
     </w:p>
     <w:p>
       <w:pPr>
-        <w:spacing w:after="0" w:line="240" w:lineRule="auto"/>
+        <w:spacing w:after="20"/>
       </w:pPr>
       <w:r>
-        <w:rPr>
-          <w:rFonts w:ascii="Arial" w:hAnsi="Arial" w:eastAsia="Arial"/>
-          <w:b w:val="0"/>
-          <w:sz w:val="20"/>
-        </w:rPr>
-        <w:t>[3] Pruszynski, J. A. &amp; Scott, S. H. (2012). Optimal feedback control and the long-latency stretch response. Experimental Brain Research, 218, 341?359.</w:t>
+        <w:t>The policy maps the current state s_t and route cue c to an action; the physics advances the state under perturbation w_t. At y = 5 m, we analyze the reduced lateral state z = (x, v_x) separately for each route, with the forward speed at its plateau:</w:t>
       </w:r>
     </w:p>
     <w:p>
       <w:pPr>
-        <w:spacing w:after="0" w:line="240" w:lineRule="auto"/>
+        <w:spacing w:before="20" w:after="40"/>
+        <w:jc w:val="center"/>
+      </w:pPr>
+      <m:oMathPara>
+        <m:oMath>
+          <m:sSub>
+            <m:e>
+              <m:r>
+                <m:t>s</m:t>
+              </m:r>
+            </m:e>
+            <m:sub>
+              <m:r>
+                <m:t>t+1</m:t>
+              </m:r>
+            </m:sub>
+          </m:sSub>
+          <m:r>
+            <m:t xml:space="preserve"> = F_phys(</m:t>
+          </m:r>
+          <m:sSub>
+            <m:e>
+              <m:r>
+                <m:t>s</m:t>
+              </m:r>
+            </m:e>
+            <m:sub>
+              <m:r>
+                <m:t>t</m:t>
+              </m:r>
+            </m:sub>
+          </m:sSub>
+          <m:r>
+            <m:t xml:space="preserve">, </m:t>
+          </m:r>
+          <m:sSub>
+            <m:e>
+              <m:r>
+                <m:t>π</m:t>
+              </m:r>
+            </m:e>
+            <m:sub>
+              <m:r>
+                <m:t>θ</m:t>
+              </m:r>
+            </m:sub>
+          </m:sSub>
+          <m:r>
+            <m:t>(</m:t>
+          </m:r>
+          <m:sSub>
+            <m:e>
+              <m:r>
+                <m:t>s</m:t>
+              </m:r>
+            </m:e>
+            <m:sub>
+              <m:r>
+                <m:t>t</m:t>
+              </m:r>
+            </m:sub>
+          </m:sSub>
+          <m:r>
+            <m:t xml:space="preserve">; c), </m:t>
+          </m:r>
+          <m:sSub>
+            <m:e>
+              <m:r>
+                <m:t>w</m:t>
+              </m:r>
+            </m:e>
+            <m:sub>
+              <m:r>
+                <m:t>t</m:t>
+              </m:r>
+            </m:sub>
+          </m:sSub>
+          <m:r>
+            <m:t>)</m:t>
+          </m:r>
+        </m:oMath>
+      </m:oMathPara>
+      <w:r>
+        <w:rPr>
+          <w:rFonts w:ascii="Cambria Math" w:hAnsi="Cambria Math" w:eastAsia="Cambria Math"/>
+          <w:b w:val="0"/>
+          <w:sz w:val="22"/>
+        </w:rPr>
+        <w:t xml:space="preserve">  (1)</w:t>
+      </w:r>
+    </w:p>
+    <w:p>
+      <w:pPr>
+        <w:spacing w:after="20"/>
       </w:pPr>
       <w:r>
-        <w:rPr>
-          <w:rFonts w:ascii="Arial" w:hAnsi="Arial" w:eastAsia="Arial"/>
-          <w:b w:val="0"/>
-          <w:sz w:val="20"/>
-        </w:rPr>
-        <w:t>[4] Nashed, J. Y., Crevecoeur, F. &amp; Scott, S. H. (2014). Rapid online selection between multiple motor plans. Journal of Neuroscience, 34, 1769?1780.</w:t>
+        <w:t>With perturbation absent, a route-specific fixed point satisfies the reduced closed-loop update below; J* is its local Jacobian. A spectral radius below one indicates local stability for this discrete-time system:</w:t>
       </w:r>
     </w:p>
+    <w:p>
+      <w:pPr>
+        <w:spacing w:before="20" w:after="40"/>
+        <w:jc w:val="center"/>
+      </w:pPr>
+      <m:oMathPara>
+        <m:oMath>
+          <m:sSup>
+            <m:e>
+              <m:r>
+                <m:t>z</m:t>
+              </m:r>
+            </m:e>
+            <m:sup>
+              <m:r>
+                <m:t>*</m:t>
+              </m:r>
+            </m:sup>
+          </m:sSup>
+          <m:r>
+            <m:t xml:space="preserve"> = F_cl(</m:t>
+          </m:r>
+          <m:sSup>
+            <m:e>
+              <m:r>
+                <m:t>z</m:t>
+              </m:r>
+            </m:e>
+            <m:sup>
+              <m:r>
+                <m:t>*</m:t>
+              </m:r>
+            </m:sup>
+          </m:sSup>
+          <m:r>
+            <m:t xml:space="preserve">; c, 0),  </m:t>
+          </m:r>
+          <m:r>
+            <m:t>ρ</m:t>
+          </m:r>
+          <m:r>
+            <m:t>(</m:t>
+          </m:r>
+          <m:sSup>
+            <m:e>
+              <m:r>
+                <m:t>J</m:t>
+              </m:r>
+            </m:e>
+            <m:sup>
+              <m:r>
+                <m:t>*</m:t>
+              </m:r>
+            </m:sup>
+          </m:sSup>
+          <m:r>
+            <m:t>) &lt; 1</m:t>
+          </m:r>
+        </m:oMath>
+      </m:oMathPara>
+      <w:r>
+        <w:rPr>
+          <w:rFonts w:ascii="Cambria Math" w:hAnsi="Cambria Math" w:eastAsia="Cambria Math"/>
+          <w:b w:val="0"/>
+          <w:sz w:val="22"/>
+        </w:rPr>
+        <w:t xml:space="preserve">  (2)</w:t>
+      </w:r>
+    </w:p>
+    <w:p>
+      <w:pPr>
+        <w:spacing w:after="60"/>
+      </w:pPr>
+      <w:r>
+        <w:t>Both routes had stable, nonoscillatory fixed points at x*=3.32 m and 6.71 m, within 0.11 m and 0.09 m of completed-episode crossings. The routes cleared the obstacles by 0.43 m and 0.46 m. Relaxation times (1.42 s and 1.34 s) describe model dynamics, not human response latency. Biological reaching also shows graded corrections to unexpected forces while movement continues, supported by coordinated muscle activity (Pruszynski &amp; Scott, 2012; Nashed et al., 2014). This is an organizational comparison, not evidence of neural or muscular equivalence. Results are from one training seed; fixed-point locations vary with checkpoint.</w:t>
+      </w:r>
+    </w:p>
+    <w:p>
+      <w:pPr>
+        <w:spacing w:after="60"/>
+      </w:pPr>
+      <w:r>
+        <w:t>A multinomial logistic-regression decoder classified the perturbation condition from single-timestep hidden activity. Cross-validation held out entire episodes. After the impulse (step 54 onward), mean accuracy was 0.81 (chance = 0.14); before the impulse it was 0.11, at chance. Errors were mainly between neighboring magnitudes on the same side. The decoder shows that condition information is linearly readable after the perturbation, not that the policy causally uses that representation.</w:t>
+      </w:r>
+    </w:p>
+    <w:tbl>
+      <w:tblPr>
+        <w:tblW w:type="auto" w:w="0"/>
+        <w:jc w:val="center"/>
+        <w:tblLayout w:type="fixed"/>
+        <w:tblLook w:firstColumn="1" w:firstRow="1" w:lastColumn="0" w:lastRow="0" w:noHBand="0" w:noVBand="1" w:val="04A0"/>
+      </w:tblPr>
+      <w:tblGrid>
+        <w:gridCol w:w="5400"/>
+        <w:gridCol w:w="5400"/>
+      </w:tblGrid>
+      <w:tr>
+        <w:tc>
+          <w:tcPr>
+            <w:tcW w:type="dxa" w:w="6264"/>
+            <w:tcW w:w="6263" w:type="dxa"/>
+            <w:tcMar>
+              <w:top w:w="0" w:type="dxa"/>
+              <w:start w:w="35" w:type="dxa"/>
+              <w:bottom w:w="0" w:type="dxa"/>
+              <w:end w:w="35" w:type="dxa"/>
+            </w:tcMar>
+            <w:vAlign w:val="top"/>
+            <w:tcBorders>
+              <w:top w:val="nil"/>
+              <w:left w:val="nil"/>
+              <w:bottom w:val="nil"/>
+              <w:right w:val="nil"/>
+              <w:insideH w:val="nil"/>
+              <w:insideV w:val="nil"/>
+            </w:tcBorders>
+          </w:tcPr>
+          <w:p>
+            <w:pPr>
+              <w:spacing w:after="0"/>
+              <w:jc w:val="center"/>
+            </w:pPr>
+            <w:r>
+              <w:drawing>
+                <wp:inline xmlns:a="http://schemas.openxmlformats.org/drawingml/2006/main" xmlns:pic="http://schemas.openxmlformats.org/drawingml/2006/picture">
+                  <wp:extent cx="3474720" cy="4044930"/>
+                  <wp:docPr id="1" name="Picture 1" descr="Three-panel composite of perturbed trajectories, hidden-layer PC1-PC2 activity, and closed-loop lateral acceleration fixed points."/>
+                  <wp:cNvGraphicFramePr>
+                    <a:graphicFrameLocks noChangeAspect="1"/>
+                  </wp:cNvGraphicFramePr>
+                  <a:graphic>
+                    <a:graphicData uri="http://schemas.openxmlformats.org/drawingml/2006/picture">
+                      <pic:pic>
+                        <pic:nvPicPr>
+                          <pic:cNvPr id="0" name="fig_composite_obstacle_avoidance_mechanism.png"/>
+                          <pic:cNvPicPr/>
+                        </pic:nvPicPr>
+                        <pic:blipFill>
+                          <a:blip r:embed="rId9"/>
+                          <a:stretch>
+                            <a:fillRect/>
+                          </a:stretch>
+                        </pic:blipFill>
+                        <pic:spPr>
+                          <a:xfrm>
+                            <a:off x="0" y="0"/>
+                            <a:ext cx="3474720" cy="4044930"/>
+                          </a:xfrm>
+                          <a:prstGeom prst="rect"/>
+                        </pic:spPr>
+                      </pic:pic>
+                    </a:graphicData>
+                  </a:graphic>
+                </wp:inline>
+              </w:drawing>
+            </w:r>
+          </w:p>
+          <w:p>
+            <w:pPr>
+              <w:spacing w:before="40" w:after="0" w:line="240" w:lineRule="auto"/>
+            </w:pPr>
+            <w:r>
+              <w:rPr>
+                <w:rFonts w:ascii="Arial" w:hAnsi="Arial" w:eastAsia="Arial"/>
+                <w:b/>
+                <w:sz w:val="18"/>
+              </w:rPr>
+              <w:t xml:space="preserve">Figure 1. </w:t>
+            </w:r>
+            <w:r>
+              <w:rPr>
+                <w:rFonts w:ascii="Arial" w:hAnsi="Arial" w:eastAsia="Arial"/>
+                <w:b w:val="0"/>
+                <w:sz w:val="18"/>
+              </w:rPr>
+              <w:t>Obstacle avoidance and closed-loop organization. (A) Baseline and perturbation trajectories; the strongest rightward impulse caused collisions on the left route. Stars mark fixed points at y = 5 m. (B) Hidden-layer activity projected onto PC1-PC2, colored by step, with fixed-point routes. (C) Commanded lateral acceleration at y = 5 m; stable fixed points are negative-slope zero crossings.</w:t>
+            </w:r>
+          </w:p>
+        </w:tc>
+        <w:tc>
+          <w:tcPr>
+            <w:tcW w:type="dxa" w:w="4392"/>
+            <w:tcW w:w="4392" w:type="dxa"/>
+            <w:tcMar>
+              <w:top w:w="0" w:type="dxa"/>
+              <w:start w:w="35" w:type="dxa"/>
+              <w:bottom w:w="0" w:type="dxa"/>
+              <w:end w:w="35" w:type="dxa"/>
+            </w:tcMar>
+            <w:vAlign w:val="top"/>
+            <w:tcBorders>
+              <w:top w:val="nil"/>
+              <w:left w:val="nil"/>
+              <w:bottom w:val="nil"/>
+              <w:right w:val="nil"/>
+              <w:insideH w:val="nil"/>
+              <w:insideV w:val="nil"/>
+            </w:tcBorders>
+          </w:tcPr>
+          <w:p>
+            <w:pPr>
+              <w:spacing w:after="0"/>
+              <w:jc w:val="center"/>
+            </w:pPr>
+            <w:r>
+              <w:drawing>
+                <wp:inline xmlns:a="http://schemas.openxmlformats.org/drawingml/2006/main" xmlns:pic="http://schemas.openxmlformats.org/drawingml/2006/picture">
+                  <wp:extent cx="2587752" cy="2136400"/>
+                  <wp:docPr id="2" name="Picture 2" descr="Row-normalized confusion matrix for predicting seven perturbation conditions from hidden-layer activity after the impulse."/>
+                  <wp:cNvGraphicFramePr>
+                    <a:graphicFrameLocks noChangeAspect="1"/>
+                  </wp:cNvGraphicFramePr>
+                  <a:graphic>
+                    <a:graphicData uri="http://schemas.openxmlformats.org/drawingml/2006/picture">
+                      <pic:pic>
+                        <pic:nvPicPr>
+                          <pic:cNvPr id="0" name="fig5_decoding.png"/>
+                          <pic:cNvPicPr/>
+                        </pic:nvPicPr>
+                        <pic:blipFill>
+                          <a:blip r:embed="rId10"/>
+                          <a:stretch>
+                            <a:fillRect/>
+                          </a:stretch>
+                        </pic:blipFill>
+                        <pic:spPr>
+                          <a:xfrm>
+                            <a:off x="0" y="0"/>
+                            <a:ext cx="2587752" cy="2136400"/>
+                          </a:xfrm>
+                          <a:prstGeom prst="rect"/>
+                        </pic:spPr>
+                      </pic:pic>
+                    </a:graphicData>
+                  </a:graphic>
+                </wp:inline>
+              </w:drawing>
+            </w:r>
+          </w:p>
+          <w:p>
+            <w:pPr>
+              <w:spacing w:before="40" w:after="0" w:line="240" w:lineRule="auto"/>
+            </w:pPr>
+            <w:r>
+              <w:rPr>
+                <w:rFonts w:ascii="Arial" w:hAnsi="Arial" w:eastAsia="Arial"/>
+                <w:b/>
+                <w:sz w:val="18"/>
+              </w:rPr>
+              <w:t xml:space="preserve">Figure 2. </w:t>
+            </w:r>
+            <w:r>
+              <w:rPr>
+                <w:rFonts w:ascii="Arial" w:hAnsi="Arial" w:eastAsia="Arial"/>
+                <w:b w:val="0"/>
+                <w:sz w:val="18"/>
+              </w:rPr>
+              <w:t>Linear prediction of perturbation condition from hidden activity after the impulse. Rows are true conditions; columns are predictions. Entries are row-normalized proportions from episode-held-out cross-validation (accuracy = 0.81; chance = 0.14). Most errors are between neighboring magnitudes on the same side.</w:t>
+            </w:r>
+          </w:p>
+        </w:tc>
+      </w:tr>
+    </w:tbl>
     <w:sectPr>
       <w:pgSz w:w="12240" w:h="15840"/>
-      <w:pgMar w:top="792" w:right="792" w:bottom="792" w:left="792" w:header="360" w:footer="360" w:gutter="0"/>
+      <w:pgMar w:top="720" w:right="720" w:bottom="720" w:left="720" w:header="360" w:footer="360" w:gutter="0"/>
       <w:cols w:space="720"/>
       <w:docGrid w:linePitch="360"/>
     </w:sectPr>
@@ -613,7 +874,7 @@
     <w:qFormat/>
     <w:rsid w:val="00FC693F"/>
     <w:pPr>
-      <w:spacing w:after="80" w:line="240" w:lineRule="auto"/>
+      <w:spacing w:after="60" w:line="240" w:lineRule="auto"/>
     </w:pPr>
     <w:rPr>
       <w:rFonts w:ascii="Arial" w:hAnsi="Arial" w:eastAsia="Arial"/>

</xml_diff>

<commit_message>
Clarify COSYNE abstract without equations
Remove displayed equations, expand the plain-language explanation of the policy–physics loop and stability analysis, and make the biological comparison more cautious. Keep both figures with 10-point captions and retain the two-page format.

Co-authored-by: Copilot <223556219+Copilot@users.noreply.github.com>
</commit_message>
<xml_diff>
--- a/presentation/poster/COSYNE_2027_Poster_Abstract.docx
+++ b/presentation/poster/COSYNE_2027_Poster_Abstract.docx
@@ -12,6 +12,7 @@
         <w:rPr>
           <w:rFonts w:ascii="Arial" w:hAnsi="Arial" w:eastAsia="Arial"/>
           <w:b/>
+          <w:color w:val="1F3E5B"/>
           <w:sz w:val="32"/>
         </w:rPr>
         <w:t>Population organization and closed-loop attractors for obstacle avoidance under perturbation</w:t>
@@ -20,37 +21,16 @@
     <w:p>
       <w:pPr>
         <w:keepNext/>
-        <w:spacing w:before="60" w:after="40"/>
+        <w:spacing w:before="80" w:after="40"/>
       </w:pPr>
       <w:r>
         <w:rPr>
           <w:rFonts w:ascii="Arial" w:hAnsi="Arial" w:eastAsia="Arial"/>
           <w:b/>
+          <w:color w:val="1F3E5B"/>
           <w:sz w:val="24"/>
         </w:rPr>
-        <w:t>Summary (226 words; 300-word maximum)</w:t>
-      </w:r>
-    </w:p>
-    <w:p>
-      <w:pPr>
-        <w:spacing w:after="100"/>
-      </w:pPr>
-      <w:r>
-        <w:t>Motor systems must adjust ongoing actions when unexpected forces occur, yet continue toward a goal and respect physical constraints. How can a learned controller organize such corrections when obstacles narrow the available route? We asked whether reward-based training alone can produce structured obstacle avoidance and whether the resulting activity offers an organizational comparison with biological motor control. We trained a proximal policy optimization (PPO) controller to move a point mass through a corridor with two obstacles. Its feedforward multilayer perceptron (MLP) actor had two 256-unit hidden layers. We analyzed the activity of a 256-unit hidden-unit population using principal component analysis (PCA), clustering, kinematic tuning, linear decoding, and closed-loop dynamical analysis of the policy coupled to the physics. Moderate lateral perturbations produced path changes under 0.1 m while the controller continued toward the goal. The first two principal components explained 71% of activity variance; activity followed phase-ordered routes shared across perturbation conditions and separated by detour. At the obstacle band, the closed loop had two stable lateral fixed points, one per route (x*=3.32 m and 6.71 m), with similar relaxation times (1.42 s and 1.34 s) and clearances (0.43 m and 0.46 m). These results show that reward learning can yield structured, locally stabilizing routes in this model. The resemblance to biological reaching is organizational, not evidence of neural equivalence; results are from one training seed.</w:t>
-      </w:r>
-    </w:p>
-    <w:p>
-      <w:pPr>
-        <w:keepNext/>
-        <w:spacing w:before="60" w:after="40"/>
-      </w:pPr>
-      <w:r>
-        <w:rPr>
-          <w:rFonts w:ascii="Arial" w:hAnsi="Arial" w:eastAsia="Arial"/>
-          <w:b/>
-          <w:sz w:val="24"/>
-        </w:rPr>
-        <w:t>Additional detail: question and approach</w:t>
+        <w:t>Summary</w:t>
       </w:r>
     </w:p>
     <w:p>
@@ -58,55 +38,46 @@
         <w:spacing w:after="80"/>
       </w:pPr>
       <w:r>
-        <w:t>Success at reaching a target does not reveal how feedback corrects movement after an unexpected force. The correction must preserve progress toward the goal while respecting the obstacle boundary. We therefore examined route structure and population activity, not only task success. Here, "population" means the 256 artificial units in one hidden layer, not neurons recorded from an animal. The feedforward actor processes each observation independently and has no recurrent memory. Accordingly, the fixed points are not equilibria of recurrent hidden activity (Sussillo &amp; Barak, 2013); they are fixed points of the complete policy-environment closed loop.</w:t>
+        <w:t>Motor systems must adjust ongoing actions after unexpected forces while maintaining goal-directed movement within spatial boundaries. This resembles biological reaching: unexpected forces prompt graded corrections, supported by coordinated muscle activity, while the hand continues toward its goal. How can a learned controller organize such corrections when obstacles narrow the available route? We asked whether reward-based training alone can produce structured obstacle avoidance and whether its activity offers an organizational comparison with biological motor control. A proximal policy optimization (PPO) actor-critic was trained for 3 million environment steps. Its feedforward multilayer perceptron (MLP), with two 256-unit hidden layers, mapped each state to an action moving a point mass through a corridor with two central obstacles. We analyzed hidden-unit activity using principal component analysis, clustering, kinematic tuning, linear decoding, and closed-loop analysis of the agent and environment physics. Moderate lateral perturbations changed the path by under 0.1 m without stopping progress toward the target. The first two principal components captured 71% of population variance; activity followed phase-ordered trajectories shared across perturbation conditions and separated by detour route. At the obstacle band, closed-loop analysis identified a stable lateral fixed point for each route (x*=3.32 m and 6.71 m), with similar relaxation times (1.42 s and 1.34 s) and clearances (0.43 m and 0.46 m). In this model, reward training produced structured routes with local stability. This offers a preliminary point of comparison with biological motor control; the model is not a neural system, and results come from one training run.</w:t>
       </w:r>
     </w:p>
     <w:p>
       <w:pPr>
         <w:keepNext/>
-        <w:spacing w:before="60" w:after="40"/>
+        <w:spacing w:before="80" w:after="40"/>
       </w:pPr>
       <w:r>
         <w:rPr>
           <w:rFonts w:ascii="Arial" w:hAnsi="Arial" w:eastAsia="Arial"/>
           <w:b/>
+          <w:color w:val="1F3E5B"/>
           <w:sz w:val="24"/>
         </w:rPr>
-        <w:t>Model and perturbation protocol</w:t>
+        <w:t>Additional details</w:t>
       </w:r>
     </w:p>
     <w:p>
       <w:pPr>
-        <w:spacing w:after="0"/>
+        <w:spacing w:after="60"/>
       </w:pPr>
       <w:r>
-        <w:t>A proximal policy optimization actor-critic was trained for 3 million environment steps. The actor was a feedforward multilayer perceptron with two 256-unit hidden layers and selected an action from the current state at each timestep. We evaluated a baseline and six perturbation conditions: lateral force impulses in three magnitudes to the left or right, each lasting 14 timesteps. We analyzed activity from a 256-unit hidden layer using principal component analysis, clustering, kinematic tuning, and linear decoding. These analyses characterize activity by movement phase and route and test how much movement information can be read from the population. Motor-cortex recordings motivate this population-level comparison (Churchland et al., 2012).</w:t>
+        <w:t>To understand how the controller produced these routes, we looked at both its activity and its interaction with the task. The term "population" refers to the 256 artificial units in one hidden layer, not neurons recorded from an animal. The feedforward actor has no recurrent memory: it maps the current observation to an action. The fixed points are therefore not equilibria of the hidden layer alone; they describe the policy acting together with the point-mass physics. This differs from recurrent-network fixed-point analyses (Sussillo &amp; Barak, 2013). Motor-cortex population studies provide a useful organizational comparison (Churchland et al., 2012), but artificial units are not neurons.</w:t>
       </w:r>
     </w:p>
     <w:p>
       <w:pPr>
-        <w:keepNext/>
-        <w:spacing w:before="60" w:after="40"/>
+        <w:spacing w:after="60"/>
       </w:pPr>
       <w:r>
-        <w:rPr>
-          <w:rFonts w:ascii="Arial" w:hAnsi="Arial" w:eastAsia="Arial"/>
-          <w:b/>
-          <w:sz w:val="24"/>
-        </w:rPr>
-        <w:t>References</w:t>
+        <w:t>The controller was trained for 3 million environment steps. We evaluated a baseline and six conditions with lateral force impulses in three magnitudes to the left or right, each lasting 14 timesteps. Our analysis combined principal component analysis, clustering, kinematic tuning, linear decoding, and a closed-loop analysis of the policy with the environment physics.</w:t>
       </w:r>
     </w:p>
     <w:p>
       <w:pPr>
-        <w:spacing w:after="0" w:line="240" w:lineRule="auto"/>
+        <w:spacing w:after="40"/>
       </w:pPr>
       <w:r>
-        <w:rPr>
-          <w:rFonts w:ascii="Arial" w:hAnsi="Arial"/>
-          <w:sz w:val="18"/>
-        </w:rPr>
-        <w:t>Churchland et al. (2012); Sussillo &amp; Barak (2013); Pruszynski &amp; Scott (2012); Nashed et al. (2014).</w:t>
+        <w:t>Unexpected forces can also prompt graded corrections during human reaching, with coordinated muscle activity while the hand continues toward its goal (Pruszynski &amp; Scott, 2012; Nashed et al., 2014). The resemblance here is organizational only; it does not show that the model uses the same neural or muscular mechanisms. These results come from one training run, and fixed-point locations change with the checkpoint. Further runs and direct comparisons with human movement will be needed to see how robust or biologically informative this account is.</w:t>
       </w:r>
     </w:p>
     <w:p>
@@ -117,209 +88,42 @@
     <w:p>
       <w:pPr>
         <w:keepNext/>
-        <w:spacing w:before="60" w:after="40"/>
+        <w:spacing w:before="80" w:after="40"/>
       </w:pPr>
       <w:r>
-        <w:rPr>
-          <w:rFonts w:ascii="Arial" w:hAnsi="Arial" w:eastAsia="Arial"/>
-          <w:b/>
-          <w:sz w:val="24"/>
-        </w:rPr>
-        <w:t>Additional detail: closed-loop mechanism and population readout</w:t>
+        <w:t>How the controller and environment form a closed loop</w:t>
       </w:r>
     </w:p>
     <w:p>
       <w:pPr>
-        <w:spacing w:after="20"/>
+        <w:spacing w:after="0"/>
       </w:pPr>
       <w:r>
-        <w:t>The policy maps the current state s_t and route cue c to an action; the physics advances the state under perturbation w_t. At y = 5 m, we analyze the reduced lateral state z = (x, v_x) separately for each route, with the forward speed at its plateau:</w:t>
+        <w:t>At each step, the feedforward policy uses the current observation, including position, velocity, goal, and obstacle locations, to choose an action. The environment applies that action together with any external force and updates the point mass. We analyze the behavior of this combined policy-and-physics system, rather than treating the hidden layer as if it had memory of its own.</w:t>
       </w:r>
     </w:p>
     <w:p>
       <w:pPr>
-        <w:spacing w:before="20" w:after="40"/>
-        <w:jc w:val="center"/>
+        <w:spacing w:after="0"/>
       </w:pPr>
-      <m:oMathPara>
-        <m:oMath>
-          <m:sSub>
-            <m:e>
-              <m:r>
-                <m:t>s</m:t>
-              </m:r>
-            </m:e>
-            <m:sub>
-              <m:r>
-                <m:t>t+1</m:t>
-              </m:r>
-            </m:sub>
-          </m:sSub>
-          <m:r>
-            <m:t xml:space="preserve"> = F_phys(</m:t>
-          </m:r>
-          <m:sSub>
-            <m:e>
-              <m:r>
-                <m:t>s</m:t>
-              </m:r>
-            </m:e>
-            <m:sub>
-              <m:r>
-                <m:t>t</m:t>
-              </m:r>
-            </m:sub>
-          </m:sSub>
-          <m:r>
-            <m:t xml:space="preserve">, </m:t>
-          </m:r>
-          <m:sSub>
-            <m:e>
-              <m:r>
-                <m:t>π</m:t>
-              </m:r>
-            </m:e>
-            <m:sub>
-              <m:r>
-                <m:t>θ</m:t>
-              </m:r>
-            </m:sub>
-          </m:sSub>
-          <m:r>
-            <m:t>(</m:t>
-          </m:r>
-          <m:sSub>
-            <m:e>
-              <m:r>
-                <m:t>s</m:t>
-              </m:r>
-            </m:e>
-            <m:sub>
-              <m:r>
-                <m:t>t</m:t>
-              </m:r>
-            </m:sub>
-          </m:sSub>
-          <m:r>
-            <m:t xml:space="preserve">; c), </m:t>
-          </m:r>
-          <m:sSub>
-            <m:e>
-              <m:r>
-                <m:t>w</m:t>
-              </m:r>
-            </m:e>
-            <m:sub>
-              <m:r>
-                <m:t>t</m:t>
-              </m:r>
-            </m:sub>
-          </m:sSub>
-          <m:r>
-            <m:t>)</m:t>
-          </m:r>
-        </m:oMath>
-      </m:oMathPara>
       <w:r>
-        <w:rPr>
-          <w:rFonts w:ascii="Cambria Math" w:hAnsi="Cambria Math" w:eastAsia="Cambria Math"/>
-          <w:b w:val="0"/>
-          <w:sz w:val="22"/>
-        </w:rPr>
-        <w:t xml:space="preserve">  (1)</w:t>
+        <w:t>At the obstacle band (y = 5 m), we focused on lateral position and velocity (x and v_x), with forward speed held at its plateau and the perturbation turned off. For each route, a fixed point is where the commanded lateral acceleration is zero. Its negative slope means that small deviations to either side elicit a correction back toward the route. We also checked the local dynamics: real eigenvalues with magnitudes below one indicate nearby states return without oscillating.</w:t>
       </w:r>
     </w:p>
     <w:p>
       <w:pPr>
-        <w:spacing w:after="20"/>
+        <w:spacing w:after="40"/>
       </w:pPr>
       <w:r>
-        <w:t>With perturbation absent, a route-specific fixed point satisfies the reduced closed-loop update below; J* is its local Jacobian. A spectral radius below one indicates local stability for this discrete-time system:</w:t>
+        <w:t>We found one stable, non-oscillatory fixed point for each route. Their positions (3.32 m and 6.71 m) were within 0.11 m and 0.09 m of where successful episodes crossed the obstacle band; clearances were 0.43 m and 0.46 m. The 1.42 s and 1.34 s relaxation times describe the model's local return toward those points, not human response times. Figure 1 brings the trajectories, activity, and lateral dynamics together.</w:t>
       </w:r>
     </w:p>
     <w:p>
       <w:pPr>
-        <w:spacing w:before="20" w:after="40"/>
-        <w:jc w:val="center"/>
-      </w:pPr>
-      <m:oMathPara>
-        <m:oMath>
-          <m:sSup>
-            <m:e>
-              <m:r>
-                <m:t>z</m:t>
-              </m:r>
-            </m:e>
-            <m:sup>
-              <m:r>
-                <m:t>*</m:t>
-              </m:r>
-            </m:sup>
-          </m:sSup>
-          <m:r>
-            <m:t xml:space="preserve"> = F_cl(</m:t>
-          </m:r>
-          <m:sSup>
-            <m:e>
-              <m:r>
-                <m:t>z</m:t>
-              </m:r>
-            </m:e>
-            <m:sup>
-              <m:r>
-                <m:t>*</m:t>
-              </m:r>
-            </m:sup>
-          </m:sSup>
-          <m:r>
-            <m:t xml:space="preserve">; c, 0),  </m:t>
-          </m:r>
-          <m:r>
-            <m:t>ρ</m:t>
-          </m:r>
-          <m:r>
-            <m:t>(</m:t>
-          </m:r>
-          <m:sSup>
-            <m:e>
-              <m:r>
-                <m:t>J</m:t>
-              </m:r>
-            </m:e>
-            <m:sup>
-              <m:r>
-                <m:t>*</m:t>
-              </m:r>
-            </m:sup>
-          </m:sSup>
-          <m:r>
-            <m:t>) &lt; 1</m:t>
-          </m:r>
-        </m:oMath>
-      </m:oMathPara>
-      <w:r>
-        <w:rPr>
-          <w:rFonts w:ascii="Cambria Math" w:hAnsi="Cambria Math" w:eastAsia="Cambria Math"/>
-          <w:b w:val="0"/>
-          <w:sz w:val="22"/>
-        </w:rPr>
-        <w:t xml:space="preserve">  (2)</w:t>
-      </w:r>
-    </w:p>
-    <w:p>
-      <w:pPr>
-        <w:spacing w:after="60"/>
+        <w:spacing w:after="40"/>
       </w:pPr>
       <w:r>
-        <w:t>Both routes had stable, nonoscillatory fixed points at x*=3.32 m and 6.71 m, within 0.11 m and 0.09 m of completed-episode crossings. The routes cleared the obstacles by 0.43 m and 0.46 m. Relaxation times (1.42 s and 1.34 s) describe model dynamics, not human response latency. Biological reaching also shows graded corrections to unexpected forces while movement continues, supported by coordinated muscle activity (Pruszynski &amp; Scott, 2012; Nashed et al., 2014). This is an organizational comparison, not evidence of neural or muscular equivalence. Results are from one training seed; fixed-point locations vary with checkpoint.</w:t>
-      </w:r>
-    </w:p>
-    <w:p>
-      <w:pPr>
-        <w:spacing w:after="60"/>
-      </w:pPr>
-      <w:r>
-        <w:t>A multinomial logistic-regression decoder classified the perturbation condition from single-timestep hidden activity. Cross-validation held out entire episodes. After the impulse (step 54 onward), mean accuracy was 0.81 (chance = 0.14); before the impulse it was 0.11, at chance. Errors were mainly between neighboring magnitudes on the same side. The decoder shows that condition information is linearly readable after the perturbation, not that the policy causally uses that representation.</w:t>
+        <w:t>We also tested whether the hidden activity contained information about the perturbation. A linear decoder, evaluated on held-out episodes, identified the condition with 0.81 accuracy after the impulse (chance = 0.14), but only 0.11 before it. Most errors were between neighboring force magnitudes on the same side. This shows that perturbation information could be read from activity after the force; it does not show that the policy used that information to choose its action (Figure 2). Taken together, the results suggest that reward training can produce organized, locally stable routes in this model. They are an initial comparison point for biological motor control, not evidence that the model reproduces neural control.</w:t>
       </w:r>
     </w:p>
     <w:tbl>
@@ -330,21 +134,20 @@
         <w:tblLook w:firstColumn="1" w:firstRow="1" w:lastColumn="0" w:lastRow="0" w:noHBand="0" w:noVBand="1" w:val="04A0"/>
       </w:tblPr>
       <w:tblGrid>
-        <w:gridCol w:w="5400"/>
-        <w:gridCol w:w="5400"/>
+        <w:gridCol w:w="5328"/>
+        <w:gridCol w:w="5328"/>
       </w:tblGrid>
       <w:tr>
         <w:tc>
           <w:tcPr>
-            <w:tcW w:type="dxa" w:w="6264"/>
-            <w:tcW w:w="6263" w:type="dxa"/>
+            <w:tcW w:type="dxa" w:w="5832"/>
+            <w:tcW w:w="5832" w:type="dxa"/>
             <w:tcMar>
               <w:top w:w="0" w:type="dxa"/>
-              <w:start w:w="35" w:type="dxa"/>
+              <w:start w:w="45" w:type="dxa"/>
               <w:bottom w:w="0" w:type="dxa"/>
-              <w:end w:w="35" w:type="dxa"/>
+              <w:end w:w="45" w:type="dxa"/>
             </w:tcMar>
-            <w:vAlign w:val="top"/>
             <w:tcBorders>
               <w:top w:val="nil"/>
               <w:left w:val="nil"/>
@@ -353,6 +156,7 @@
               <w:insideH w:val="nil"/>
               <w:insideV w:val="nil"/>
             </w:tcBorders>
+            <w:vAlign w:val="top"/>
           </w:tcPr>
           <w:p>
             <w:pPr>
@@ -362,8 +166,8 @@
             <w:r>
               <w:drawing>
                 <wp:inline xmlns:a="http://schemas.openxmlformats.org/drawingml/2006/main" xmlns:pic="http://schemas.openxmlformats.org/drawingml/2006/picture">
-                  <wp:extent cx="3474720" cy="4044930"/>
-                  <wp:docPr id="1" name="Picture 1" descr="Three-panel composite of perturbed trajectories, hidden-layer PC1-PC2 activity, and closed-loop lateral acceleration fixed points."/>
+                  <wp:extent cx="3319272" cy="3863973"/>
+                  <wp:docPr id="1" name="Picture 1" descr="COSYNE abstract figure, described in the adjacent caption."/>
                   <wp:cNvGraphicFramePr>
                     <a:graphicFrameLocks noChangeAspect="1"/>
                   </wp:cNvGraphicFramePr>
@@ -383,7 +187,7 @@
                         <pic:spPr>
                           <a:xfrm>
                             <a:off x="0" y="0"/>
-                            <a:ext cx="3474720" cy="4044930"/>
+                            <a:ext cx="3319272" cy="3863973"/>
                           </a:xfrm>
                           <a:prstGeom prst="rect"/>
                         </pic:spPr>
@@ -396,37 +200,30 @@
           </w:p>
           <w:p>
             <w:pPr>
+              <w:keepLines/>
               <w:spacing w:before="40" w:after="0" w:line="240" w:lineRule="auto"/>
             </w:pPr>
             <w:r>
               <w:rPr>
                 <w:rFonts w:ascii="Arial" w:hAnsi="Arial" w:eastAsia="Arial"/>
                 <w:b/>
-                <w:sz w:val="18"/>
+                <w:color w:val="1F3E5B"/>
+                <w:sz w:val="20"/>
               </w:rPr>
-              <w:t xml:space="preserve">Figure 1. </w:t>
-            </w:r>
-            <w:r>
-              <w:rPr>
-                <w:rFonts w:ascii="Arial" w:hAnsi="Arial" w:eastAsia="Arial"/>
-                <w:b w:val="0"/>
-                <w:sz w:val="18"/>
-              </w:rPr>
-              <w:t>Obstacle avoidance and closed-loop organization. (A) Baseline and perturbation trajectories; the strongest rightward impulse caused collisions on the left route. Stars mark fixed points at y = 5 m. (B) Hidden-layer activity projected onto PC1-PC2, colored by step, with fixed-point routes. (C) Commanded lateral acceleration at y = 5 m; stable fixed points are negative-slope zero crossings.</w:t>
+              <w:t>Figure 1. Task and closed-loop results. (A) Baseline and perturbed trajectories; only the strongest rightward impulse caused collisions, on the left route. Stars mark route fixed points at y = 5 m. (B) Hidden activity in PC1-PC2 space, colored by step. (C) Commanded lateral acceleration; each route has a stable, negative-slope zero crossing.</w:t>
             </w:r>
           </w:p>
         </w:tc>
         <w:tc>
           <w:tcPr>
-            <w:tcW w:type="dxa" w:w="4392"/>
-            <w:tcW w:w="4392" w:type="dxa"/>
+            <w:tcW w:type="dxa" w:w="4579"/>
+            <w:tcW w:w="4579" w:type="dxa"/>
             <w:tcMar>
               <w:top w:w="0" w:type="dxa"/>
-              <w:start w:w="35" w:type="dxa"/>
+              <w:start w:w="45" w:type="dxa"/>
               <w:bottom w:w="0" w:type="dxa"/>
-              <w:end w:w="35" w:type="dxa"/>
+              <w:end w:w="45" w:type="dxa"/>
             </w:tcMar>
-            <w:vAlign w:val="top"/>
             <w:tcBorders>
               <w:top w:val="nil"/>
               <w:left w:val="nil"/>
@@ -435,6 +232,7 @@
               <w:insideH w:val="nil"/>
               <w:insideV w:val="nil"/>
             </w:tcBorders>
+            <w:vAlign w:val="top"/>
           </w:tcPr>
           <w:p>
             <w:pPr>
@@ -444,8 +242,8 @@
             <w:r>
               <w:drawing>
                 <wp:inline xmlns:a="http://schemas.openxmlformats.org/drawingml/2006/main" xmlns:pic="http://schemas.openxmlformats.org/drawingml/2006/picture">
-                  <wp:extent cx="2587752" cy="2136400"/>
-                  <wp:docPr id="2" name="Picture 2" descr="Row-normalized confusion matrix for predicting seven perturbation conditions from hidden-layer activity after the impulse."/>
+                  <wp:extent cx="2560320" cy="2113753"/>
+                  <wp:docPr id="2" name="Picture 2" descr="COSYNE abstract figure, described in the adjacent caption."/>
                   <wp:cNvGraphicFramePr>
                     <a:graphicFrameLocks noChangeAspect="1"/>
                   </wp:cNvGraphicFramePr>
@@ -465,7 +263,7 @@
                         <pic:spPr>
                           <a:xfrm>
                             <a:off x="0" y="0"/>
-                            <a:ext cx="2587752" cy="2136400"/>
+                            <a:ext cx="2560320" cy="2113753"/>
                           </a:xfrm>
                           <a:prstGeom prst="rect"/>
                         </pic:spPr>
@@ -478,13 +276,15 @@
           </w:p>
           <w:p>
             <w:pPr>
+              <w:keepLines/>
               <w:spacing w:before="40" w:after="0" w:line="240" w:lineRule="auto"/>
             </w:pPr>
             <w:r>
               <w:rPr>
                 <w:rFonts w:ascii="Arial" w:hAnsi="Arial" w:eastAsia="Arial"/>
                 <w:b/>
-                <w:sz w:val="18"/>
+                <w:color w:val="1F3E5B"/>
+                <w:sz w:val="20"/>
               </w:rPr>
               <w:t xml:space="preserve">Figure 2. </w:t>
             </w:r>
@@ -492,9 +292,10 @@
               <w:rPr>
                 <w:rFonts w:ascii="Arial" w:hAnsi="Arial" w:eastAsia="Arial"/>
                 <w:b w:val="0"/>
-                <w:sz w:val="18"/>
+                <w:color w:val="262B30"/>
+                <w:sz w:val="20"/>
               </w:rPr>
-              <w:t>Linear prediction of perturbation condition from hidden activity after the impulse. Rows are true conditions; columns are predictions. Entries are row-normalized proportions from episode-held-out cross-validation (accuracy = 0.81; chance = 0.14). Most errors are between neighboring magnitudes on the same side.</w:t>
+              <w:t>Prediction of perturbation condition from hidden activity after the impulse. Rows show true conditions and columns predictions; values are row-normalized proportions from episode-held-out validation (accuracy = 0.81; chance = 0.14). Most errors are between neighboring magnitudes on the same side.</w:t>
             </w:r>
           </w:p>
         </w:tc>
@@ -502,7 +303,7 @@
     </w:tbl>
     <w:sectPr>
       <w:pgSz w:w="12240" w:h="15840"/>
-      <w:pgMar w:top="720" w:right="720" w:bottom="720" w:left="720" w:header="360" w:footer="360" w:gutter="0"/>
+      <w:pgMar w:top="691" w:right="792" w:bottom="691" w:left="792" w:header="720" w:footer="720" w:gutter="0"/>
       <w:cols w:space="720"/>
       <w:docGrid w:linePitch="360"/>
     </w:sectPr>
@@ -878,6 +679,7 @@
     </w:pPr>
     <w:rPr>
       <w:rFonts w:ascii="Arial" w:hAnsi="Arial" w:eastAsia="Arial"/>
+      <w:color w:val="262B30"/>
       <w:sz w:val="24"/>
     </w:rPr>
   </w:style>

</xml_diff>

<commit_message>
Polish COSYNE summary and figure layout
Set all text to black, make the summary exactly 295 words by Word’s count, and place figures separately with 10-point aligned captions and explanatory text between them. Keep two-page anonymous output.

Co-authored-by: Copilot <223556219+Copilot@users.noreply.github.com>
</commit_message>
<xml_diff>
--- a/presentation/poster/COSYNE_2027_Poster_Abstract.docx
+++ b/presentation/poster/COSYNE_2027_Poster_Abstract.docx
@@ -12,10 +12,38 @@
         <w:rPr>
           <w:rFonts w:ascii="Arial" w:hAnsi="Arial" w:eastAsia="Arial"/>
           <w:b/>
-          <w:color w:val="1F3E5B"/>
-          <w:sz w:val="32"/>
+          <w:color w:val="000000"/>
+          <w:sz w:val="30"/>
         </w:rPr>
         <w:t>Population organization and closed-loop attractors for obstacle avoidance under perturbation</w:t>
+      </w:r>
+    </w:p>
+    <w:p>
+      <w:pPr>
+        <w:keepNext/>
+        <w:spacing w:before="40" w:after="40"/>
+      </w:pPr>
+      <w:r>
+        <w:rPr>
+          <w:rFonts w:ascii="Arial" w:hAnsi="Arial" w:eastAsia="Arial"/>
+          <w:b/>
+          <w:color w:val="000000"/>
+          <w:sz w:val="24"/>
+        </w:rPr>
+        <w:t>Summary</w:t>
+      </w:r>
+    </w:p>
+    <w:p>
+      <w:pPr>
+        <w:spacing w:after="80"/>
+      </w:pPr>
+      <w:r>
+        <w:rPr>
+          <w:rFonts w:ascii="Arial" w:hAnsi="Arial" w:eastAsia="Arial"/>
+          <w:color w:val="000000"/>
+          <w:sz w:val="24"/>
+        </w:rPr>
+        <w:t>Motor systems must adjust actions after unexpected forces while maintaining goal-directed movement within physical boundaries. In human reaching, such forces can prompt graded corrections supported by coordinated muscle activity while the hand continues toward its goal. How can a learned controller organize these corrections when obstacles narrow the available route? We asked whether reward-based learning alone can produce structured obstacle avoidance and whether its population activity offers an organizational comparison with biological motor control. We trained a proximal policy optimization (PPO) actor-critic for 3 million environment steps. Its feedforward multilayer perceptron (MLP), with two 256-unit hidden layers, mapped each state to an action that moved a point mass through a corridor with two obstacles. We analyzed activity from a 256-unit hidden layer using principal component analysis (PCA), clustering, kinematic tuning, linear decoding, and closed-loop analysis of the controller coupled to the environment physics. Moderate lateral perturbations changed the path by less than 0.1 m without stopping progress toward the target. The first two principal components captured 71% of hidden-unit activity variance, and activity followed phase-ordered trajectories shared across perturbation conditions but separated by detour route. At the obstacle band, analysis of the policy and physics identified a stable lateral fixed point for each route (x*=3.32 m and 6.71 m), with similar relaxation times (1.42 s and 1.34 s) and clearances (0.43 m and 0.46 m). These findings suggest reward training can produce organized, locally stabilizing routes in this model. Motor-cortex studies describe reaching-related activity at the population level, and human perturbation studies report graded corrections during movement. This is a limited organizational comparison, not evidence that model units reproduce neural or muscle mechanisms. Because results come from one training run, further seeds and comparisons with biological movement will be needed to assess robustness and relevance.</w:t>
       </w:r>
     </w:p>
     <w:p>
@@ -27,30 +55,7 @@
         <w:rPr>
           <w:rFonts w:ascii="Arial" w:hAnsi="Arial" w:eastAsia="Arial"/>
           <w:b/>
-          <w:color w:val="1F3E5B"/>
-          <w:sz w:val="24"/>
-        </w:rPr>
-        <w:t>Summary</w:t>
-      </w:r>
-    </w:p>
-    <w:p>
-      <w:pPr>
-        <w:spacing w:after="80"/>
-      </w:pPr>
-      <w:r>
-        <w:t>Motor systems must adjust ongoing actions after unexpected forces while maintaining goal-directed movement within spatial boundaries. This resembles biological reaching: unexpected forces prompt graded corrections, supported by coordinated muscle activity, while the hand continues toward its goal. How can a learned controller organize such corrections when obstacles narrow the available route? We asked whether reward-based training alone can produce structured obstacle avoidance and whether its activity offers an organizational comparison with biological motor control. A proximal policy optimization (PPO) actor-critic was trained for 3 million environment steps. Its feedforward multilayer perceptron (MLP), with two 256-unit hidden layers, mapped each state to an action moving a point mass through a corridor with two central obstacles. We analyzed hidden-unit activity using principal component analysis, clustering, kinematic tuning, linear decoding, and closed-loop analysis of the agent and environment physics. Moderate lateral perturbations changed the path by under 0.1 m without stopping progress toward the target. The first two principal components captured 71% of population variance; activity followed phase-ordered trajectories shared across perturbation conditions and separated by detour route. At the obstacle band, closed-loop analysis identified a stable lateral fixed point for each route (x*=3.32 m and 6.71 m), with similar relaxation times (1.42 s and 1.34 s) and clearances (0.43 m and 0.46 m). In this model, reward training produced structured routes with local stability. This offers a preliminary point of comparison with biological motor control; the model is not a neural system, and results come from one training run.</w:t>
-      </w:r>
-    </w:p>
-    <w:p>
-      <w:pPr>
-        <w:keepNext/>
-        <w:spacing w:before="80" w:after="40"/>
-      </w:pPr>
-      <w:r>
-        <w:rPr>
-          <w:rFonts w:ascii="Arial" w:hAnsi="Arial" w:eastAsia="Arial"/>
-          <w:b/>
-          <w:color w:val="1F3E5B"/>
+          <w:color w:val="000000"/>
           <w:sz w:val="24"/>
         </w:rPr>
         <w:t>Additional details</w:t>
@@ -61,15 +66,56 @@
         <w:spacing w:after="60"/>
       </w:pPr>
       <w:r>
-        <w:t>To understand how the controller produced these routes, we looked at both its activity and its interaction with the task. The term "population" refers to the 256 artificial units in one hidden layer, not neurons recorded from an animal. The feedforward actor has no recurrent memory: it maps the current observation to an action. The fixed points are therefore not equilibria of the hidden layer alone; they describe the policy acting together with the point-mass physics. This differs from recurrent-network fixed-point analyses (Sussillo &amp; Barak, 2013). Motor-cortex population studies provide a useful organizational comparison (Churchland et al., 2012), but artificial units are not neurons.</w:t>
+        <w:rPr>
+          <w:rFonts w:ascii="Arial" w:hAnsi="Arial" w:eastAsia="Arial"/>
+          <w:color w:val="000000"/>
+        </w:rPr>
+        <w:t>To understand how the controller produced its routes, we examined both its hidden activity and the movement that activity helped generate. Here, ?population? means the 256 artificial units in one hidden layer, not neurons recorded from an animal. The actor is feedforward and has no recurrent memory: it maps the current observation to an action. The fixed points therefore describe the policy acting together with the point-mass physics, not equilibria of the hidden layer alone. This differs from recurrent-network fixed-point analyses (Sussillo &amp; Barak, 2013). Motor-cortex studies provide a useful organizational comparison because reaching-related activity is distributed across neural populations (Churchland et al., 2012), but artificial units are not neurons.</w:t>
       </w:r>
     </w:p>
     <w:p>
       <w:pPr>
-        <w:spacing w:after="60"/>
+        <w:spacing w:after="0"/>
       </w:pPr>
       <w:r>
-        <w:t>The controller was trained for 3 million environment steps. We evaluated a baseline and six conditions with lateral force impulses in three magnitudes to the left or right, each lasting 14 timesteps. Our analysis combined principal component analysis, clustering, kinematic tuning, linear decoding, and a closed-loop analysis of the policy with the environment physics.</w:t>
+        <w:rPr>
+          <w:rFonts w:ascii="Arial" w:hAnsi="Arial" w:eastAsia="Arial"/>
+          <w:color w:val="000000"/>
+          <w:sz w:val="24"/>
+        </w:rPr>
+        <w:t>The controller was trained for 3 million environment steps. We evaluated an unperturbed condition and six lateral-force conditions: three impulse magnitudes in each direction, each lasting 14 timesteps. We used principal component analysis, clustering, kinematic tuning, and linear decoding to examine activity, then analyzed the closed loop to ask whether its routes had stable lateral states.</w:t>
+      </w:r>
+      <w:r>
+        <w:rPr>
+          <w:rFonts w:ascii="Arial" w:hAnsi="Arial" w:eastAsia="Arial"/>
+          <w:color w:val="000000"/>
+          <w:sz w:val="24"/>
+        </w:rPr>
+        <w:t xml:space="preserve"> The first two principal components captured 71% of hidden-unit activity variance. Activity followed phase-ordered paths shared across perturbation conditions but separated by detour route.</w:t>
+      </w:r>
+    </w:p>
+    <w:p>
+      <w:r>
+        <w:rPr>
+          <w:rFonts w:ascii="Arial" w:hAnsi="Arial" w:eastAsia="Arial"/>
+          <w:color w:val="000000"/>
+        </w:rPr>
+        <w:br w:type="page"/>
+      </w:r>
+    </w:p>
+    <w:p>
+      <w:pPr>
+        <w:keepNext/>
+        <w:spacing w:before="60" w:after="40"/>
+      </w:pPr>
+      <w:r>
+        <w:rPr>
+          <w:rFonts w:ascii="Arial" w:hAnsi="Arial" w:eastAsia="Arial"/>
+          <w:b/>
+          <w:color w:val="000000"/>
+          <w:sz w:val="24"/>
+        </w:rPr>
+        <w:t>From population activity to movement</w:t>
       </w:r>
     </w:p>
     <w:p>
@@ -77,53 +123,12 @@
         <w:spacing w:after="40"/>
       </w:pPr>
       <w:r>
-        <w:t>Unexpected forces can also prompt graded corrections during human reaching, with coordinated muscle activity while the hand continues toward its goal (Pruszynski &amp; Scott, 2012; Nashed et al., 2014). The resemblance here is organizational only; it does not show that the model uses the same neural or muscular mechanisms. These results come from one training run, and fixed-point locations change with the checkpoint. Further runs and direct comparisons with human movement will be needed to see how robust or biologically informative this account is.</w:t>
-      </w:r>
-    </w:p>
-    <w:p>
-      <w:r>
-        <w:br w:type="page"/>
-      </w:r>
-    </w:p>
-    <w:p>
-      <w:pPr>
-        <w:keepNext/>
-        <w:spacing w:before="80" w:after="40"/>
-      </w:pPr>
-      <w:r>
-        <w:t>How the controller and environment form a closed loop</w:t>
-      </w:r>
-    </w:p>
-    <w:p>
-      <w:pPr>
-        <w:spacing w:after="0"/>
-      </w:pPr>
-      <w:r>
-        <w:t>At each step, the feedforward policy uses the current observation, including position, velocity, goal, and obstacle locations, to choose an action. The environment applies that action together with any external force and updates the point mass. We analyze the behavior of this combined policy-and-physics system, rather than treating the hidden layer as if it had memory of its own.</w:t>
-      </w:r>
-    </w:p>
-    <w:p>
-      <w:pPr>
-        <w:spacing w:after="0"/>
-      </w:pPr>
-      <w:r>
-        <w:t>At the obstacle band (y = 5 m), we focused on lateral position and velocity (x and v_x), with forward speed held at its plateau and the perturbation turned off. For each route, a fixed point is where the commanded lateral acceleration is zero. Its negative slope means that small deviations to either side elicit a correction back toward the route. We also checked the local dynamics: real eigenvalues with magnitudes below one indicate nearby states return without oscillating.</w:t>
-      </w:r>
-    </w:p>
-    <w:p>
-      <w:pPr>
-        <w:spacing w:after="40"/>
-      </w:pPr>
-      <w:r>
-        <w:t>We found one stable, non-oscillatory fixed point for each route. Their positions (3.32 m and 6.71 m) were within 0.11 m and 0.09 m of where successful episodes crossed the obstacle band; clearances were 0.43 m and 0.46 m. The 1.42 s and 1.34 s relaxation times describe the model's local return toward those points, not human response times. Figure 1 brings the trajectories, activity, and lateral dynamics together.</w:t>
-      </w:r>
-    </w:p>
-    <w:p>
-      <w:pPr>
-        <w:spacing w:after="40"/>
-      </w:pPr>
-      <w:r>
-        <w:t>We also tested whether the hidden activity contained information about the perturbation. A linear decoder, evaluated on held-out episodes, identified the condition with 0.81 accuracy after the impulse (chance = 0.14), but only 0.11 before it. Most errors were between neighboring force magnitudes on the same side. This shows that perturbation information could be read from activity after the force; it does not show that the policy used that information to choose its action (Figure 2). Taken together, the results suggest that reward training can produce organized, locally stable routes in this model. They are an initial comparison point for biological motor control, not evidence that the model reproduces neural control.</w:t>
+        <w:rPr>
+          <w:rFonts w:ascii="Arial" w:hAnsi="Arial" w:eastAsia="Arial"/>
+          <w:color w:val="000000"/>
+          <w:sz w:val="24"/>
+        </w:rPr>
+        <w:t>At the obstacle band (y = 5 m), with the force off and forward speed held at its plateau, we examined commanded lateral acceleration as position changed. A zero crossing with a negative slope means small sideways deviations elicit commands back toward the route. Figure 1 shows the trajectories and this stability analysis.</w:t>
       </w:r>
     </w:p>
     <w:tbl>
@@ -134,19 +139,18 @@
         <w:tblLook w:firstColumn="1" w:firstRow="1" w:lastColumn="0" w:lastRow="0" w:noHBand="0" w:noVBand="1" w:val="04A0"/>
       </w:tblPr>
       <w:tblGrid>
-        <w:gridCol w:w="5328"/>
-        <w:gridCol w:w="5328"/>
+        <w:gridCol w:w="10570"/>
       </w:tblGrid>
       <w:tr>
         <w:tc>
           <w:tcPr>
-            <w:tcW w:type="dxa" w:w="5832"/>
-            <w:tcW w:w="5832" w:type="dxa"/>
+            <w:tcW w:type="dxa" w:w="10570"/>
+            <w:vAlign w:val="center"/>
             <w:tcMar>
               <w:top w:w="0" w:type="dxa"/>
-              <w:start w:w="45" w:type="dxa"/>
+              <w:start w:w="0" w:type="dxa"/>
               <w:bottom w:w="0" w:type="dxa"/>
-              <w:end w:w="45" w:type="dxa"/>
+              <w:end w:w="0" w:type="dxa"/>
             </w:tcMar>
             <w:tcBorders>
               <w:top w:val="nil"/>
@@ -156,18 +160,22 @@
               <w:insideH w:val="nil"/>
               <w:insideV w:val="nil"/>
             </w:tcBorders>
-            <w:vAlign w:val="top"/>
           </w:tcPr>
           <w:p>
             <w:pPr>
+              <w:keepNext/>
               <w:spacing w:after="0"/>
               <w:jc w:val="center"/>
             </w:pPr>
             <w:r>
+              <w:rPr>
+                <w:rFonts w:ascii="Arial" w:hAnsi="Arial" w:eastAsia="Arial"/>
+                <w:color w:val="000000"/>
+              </w:rPr>
               <w:drawing>
                 <wp:inline xmlns:a="http://schemas.openxmlformats.org/drawingml/2006/main" xmlns:pic="http://schemas.openxmlformats.org/drawingml/2006/picture">
-                  <wp:extent cx="3319272" cy="3863973"/>
-                  <wp:docPr id="1" name="Picture 1" descr="COSYNE abstract figure, described in the adjacent caption."/>
+                  <wp:extent cx="2743200" cy="3193366"/>
+                  <wp:docPr id="1" name="Picture 1" descr="Figure 1. plot. Caption follows immediately below."/>
                   <wp:cNvGraphicFramePr>
                     <a:graphicFrameLocks noChangeAspect="1"/>
                   </wp:cNvGraphicFramePr>
@@ -187,7 +195,7 @@
                         <pic:spPr>
                           <a:xfrm>
                             <a:off x="0" y="0"/>
-                            <a:ext cx="3319272" cy="3863973"/>
+                            <a:ext cx="2743200" cy="3193366"/>
                           </a:xfrm>
                           <a:prstGeom prst="rect"/>
                         </pic:spPr>
@@ -198,31 +206,17 @@
               </w:drawing>
             </w:r>
           </w:p>
-          <w:p>
-            <w:pPr>
-              <w:keepLines/>
-              <w:spacing w:before="40" w:after="0" w:line="240" w:lineRule="auto"/>
-            </w:pPr>
-            <w:r>
-              <w:rPr>
-                <w:rFonts w:ascii="Arial" w:hAnsi="Arial" w:eastAsia="Arial"/>
-                <w:b/>
-                <w:color w:val="1F3E5B"/>
-                <w:sz w:val="20"/>
-              </w:rPr>
-              <w:t>Figure 1. Task and closed-loop results. (A) Baseline and perturbed trajectories; only the strongest rightward impulse caused collisions, on the left route. Stars mark route fixed points at y = 5 m. (B) Hidden activity in PC1-PC2 space, colored by step. (C) Commanded lateral acceleration; each route has a stable, negative-slope zero crossing.</w:t>
-            </w:r>
-          </w:p>
         </w:tc>
+      </w:tr>
+      <w:tr>
         <w:tc>
           <w:tcPr>
-            <w:tcW w:type="dxa" w:w="4579"/>
-            <w:tcW w:w="4579" w:type="dxa"/>
+            <w:tcW w:type="dxa" w:w="10570"/>
             <w:tcMar>
               <w:top w:w="0" w:type="dxa"/>
-              <w:start w:w="45" w:type="dxa"/>
+              <w:start w:w="0" w:type="dxa"/>
               <w:bottom w:w="0" w:type="dxa"/>
-              <w:end w:w="45" w:type="dxa"/>
+              <w:end w:w="0" w:type="dxa"/>
             </w:tcMar>
             <w:tcBorders>
               <w:top w:val="nil"/>
@@ -232,18 +226,91 @@
               <w:insideH w:val="nil"/>
               <w:insideV w:val="nil"/>
             </w:tcBorders>
-            <w:vAlign w:val="top"/>
           </w:tcPr>
           <w:p>
             <w:pPr>
+              <w:keepLines/>
+              <w:spacing w:before="20" w:after="60" w:line="240" w:lineRule="auto"/>
+              <w:jc w:val="left"/>
+            </w:pPr>
+            <w:r>
+              <w:rPr>
+                <w:rFonts w:ascii="Arial" w:hAnsi="Arial" w:eastAsia="Arial"/>
+                <w:b/>
+                <w:color w:val="000000"/>
+                <w:sz w:val="20"/>
+              </w:rPr>
+              <w:t xml:space="preserve">Figure 1. </w:t>
+            </w:r>
+            <w:r>
+              <w:rPr>
+                <w:rFonts w:ascii="Arial" w:hAnsi="Arial" w:eastAsia="Arial"/>
+                <w:color w:val="000000"/>
+                <w:sz w:val="20"/>
+              </w:rPr>
+              <w:t>Task and closed-loop results. (A) Baseline and perturbed trajectories; only the strongest rightward impulse caused collisions, on the left route. Stars mark fixed points at y = 5 m. (B) Hidden activity in PC1-PC2 space, colored by movement step. (C) Commanded lateral acceleration; each route has a stable zero crossing with a negative slope.</w:t>
+            </w:r>
+          </w:p>
+        </w:tc>
+      </w:tr>
+    </w:tbl>
+    <w:p>
+      <w:pPr>
+        <w:spacing w:after="40"/>
+      </w:pPr>
+      <w:r>
+        <w:rPr>
+          <w:rFonts w:ascii="Arial" w:hAnsi="Arial" w:eastAsia="Arial"/>
+          <w:color w:val="000000"/>
+        </w:rPr>
+        <w:t>The two fixed points were at x = 3.32 m and x = 6.71 m, within 0.11 m and 0.09 m of the successful episode crossings. Their routes left 0.43 m and 0.46 m of obstacle clearance. Local relaxation times were 1.42 s and 1.34 s; these describe the model returning toward its fixed points, not the latency of a human response. We next asked whether the hidden activity also carried information about which force had occurred.</w:t>
+      </w:r>
+    </w:p>
+    <w:tbl>
+      <w:tblPr>
+        <w:tblW w:type="auto" w:w="0"/>
+        <w:jc w:val="center"/>
+        <w:tblLayout w:type="fixed"/>
+        <w:tblLook w:firstColumn="1" w:firstRow="1" w:lastColumn="0" w:lastRow="0" w:noHBand="0" w:noVBand="1" w:val="04A0"/>
+      </w:tblPr>
+      <w:tblGrid>
+        <w:gridCol w:w="10570"/>
+      </w:tblGrid>
+      <w:tr>
+        <w:tc>
+          <w:tcPr>
+            <w:tcW w:type="dxa" w:w="10570"/>
+            <w:vAlign w:val="center"/>
+            <w:tcMar>
+              <w:top w:w="0" w:type="dxa"/>
+              <w:start w:w="0" w:type="dxa"/>
+              <w:bottom w:w="0" w:type="dxa"/>
+              <w:end w:w="0" w:type="dxa"/>
+            </w:tcMar>
+            <w:tcBorders>
+              <w:top w:val="nil"/>
+              <w:left w:val="nil"/>
+              <w:bottom w:val="nil"/>
+              <w:right w:val="nil"/>
+              <w:insideH w:val="nil"/>
+              <w:insideV w:val="nil"/>
+            </w:tcBorders>
+          </w:tcPr>
+          <w:p>
+            <w:pPr>
+              <w:keepNext/>
               <w:spacing w:after="0"/>
               <w:jc w:val="center"/>
             </w:pPr>
             <w:r>
+              <w:rPr>
+                <w:rFonts w:ascii="Arial" w:hAnsi="Arial" w:eastAsia="Arial"/>
+                <w:color w:val="000000"/>
+              </w:rPr>
               <w:drawing>
                 <wp:inline xmlns:a="http://schemas.openxmlformats.org/drawingml/2006/main" xmlns:pic="http://schemas.openxmlformats.org/drawingml/2006/picture">
-                  <wp:extent cx="2560320" cy="2113753"/>
-                  <wp:docPr id="2" name="Picture 2" descr="COSYNE abstract figure, described in the adjacent caption."/>
+                  <wp:extent cx="2148840" cy="1774042"/>
+                  <wp:docPr id="2" name="Picture 2" descr="Figure 2. plot. Caption follows immediately below."/>
                   <wp:cNvGraphicFramePr>
                     <a:graphicFrameLocks noChangeAspect="1"/>
                   </wp:cNvGraphicFramePr>
@@ -263,7 +330,7 @@
                         <pic:spPr>
                           <a:xfrm>
                             <a:off x="0" y="0"/>
-                            <a:ext cx="2560320" cy="2113753"/>
+                            <a:ext cx="2148840" cy="1774042"/>
                           </a:xfrm>
                           <a:prstGeom prst="rect"/>
                         </pic:spPr>
@@ -274,16 +341,38 @@
               </w:drawing>
             </w:r>
           </w:p>
+        </w:tc>
+      </w:tr>
+      <w:tr>
+        <w:tc>
+          <w:tcPr>
+            <w:tcW w:type="dxa" w:w="10570"/>
+            <w:tcMar>
+              <w:top w:w="0" w:type="dxa"/>
+              <w:start w:w="0" w:type="dxa"/>
+              <w:bottom w:w="0" w:type="dxa"/>
+              <w:end w:w="0" w:type="dxa"/>
+            </w:tcMar>
+            <w:tcBorders>
+              <w:top w:val="nil"/>
+              <w:left w:val="nil"/>
+              <w:bottom w:val="nil"/>
+              <w:right w:val="nil"/>
+              <w:insideH w:val="nil"/>
+              <w:insideV w:val="nil"/>
+            </w:tcBorders>
+          </w:tcPr>
           <w:p>
             <w:pPr>
               <w:keepLines/>
-              <w:spacing w:before="40" w:after="0" w:line="240" w:lineRule="auto"/>
+              <w:spacing w:before="20" w:after="60" w:line="240" w:lineRule="auto"/>
+              <w:jc w:val="left"/>
             </w:pPr>
             <w:r>
               <w:rPr>
                 <w:rFonts w:ascii="Arial" w:hAnsi="Arial" w:eastAsia="Arial"/>
                 <w:b/>
-                <w:color w:val="1F3E5B"/>
+                <w:color w:val="000000"/>
                 <w:sz w:val="20"/>
               </w:rPr>
               <w:t xml:space="preserve">Figure 2. </w:t>
@@ -291,24 +380,120 @@
             <w:r>
               <w:rPr>
                 <w:rFonts w:ascii="Arial" w:hAnsi="Arial" w:eastAsia="Arial"/>
-                <w:b w:val="0"/>
-                <w:color w:val="262B30"/>
+                <w:color w:val="000000"/>
                 <w:sz w:val="20"/>
               </w:rPr>
-              <w:t>Prediction of perturbation condition from hidden activity after the impulse. Rows show true conditions and columns predictions; values are row-normalized proportions from episode-held-out validation (accuracy = 0.81; chance = 0.14). Most errors are between neighboring magnitudes on the same side.</w:t>
+              <w:t>Prediction of perturbation condition from hidden activity after the impulse. Rows are true conditions and columns are predicted conditions; values are row-normalized proportions from validation that held out entire episodes (accuracy = 0.81; chance = 0.14). Errors are mostly between neighboring force magnitudes on the same side.</w:t>
             </w:r>
           </w:p>
         </w:tc>
       </w:tr>
     </w:tbl>
+    <w:p>
+      <w:pPr>
+        <w:spacing w:after="0"/>
+      </w:pPr>
+      <w:r>
+        <w:rPr>
+          <w:rFonts w:ascii="Arial" w:hAnsi="Arial" w:eastAsia="Arial"/>
+          <w:color w:val="000000"/>
+        </w:rPr>
+        <w:t>The decoder could read perturbation information after the impulse, but this does not show that the policy used it to choose an action. In biological reaching, unexpected forces also prompt graded corrections with coordinated muscle activity while the hand continues toward its goal (Pruszynski &amp; Scott, 2012; Nashed et al., 2014). We see a modest organizational parallel, not evidence that the model reproduces neural or muscular mechanisms. These results come from one training run, and fixed-point locations vary across checkpoints. Further seeds and direct comparisons with human movement will be needed to assess how robust or informative this account is.</w:t>
+      </w:r>
+    </w:p>
     <w:sectPr>
+      <w:footerReference w:type="default" r:id="rId11"/>
+      <w:headerReference w:type="default" r:id="rId12"/>
+      <w:headerReference w:type="first" r:id="rId13"/>
+      <w:footerReference w:type="first" r:id="rId14"/>
+      <w:headerReference w:type="even" r:id="rId15"/>
+      <w:footerReference w:type="even" r:id="rId16"/>
       <w:pgSz w:w="12240" w:h="15840"/>
-      <w:pgMar w:top="691" w:right="792" w:bottom="691" w:left="792" w:header="720" w:footer="720" w:gutter="0"/>
+      <w:pgMar w:top="691" w:right="835" w:bottom="691" w:left="835" w:header="317" w:footer="317" w:gutter="0"/>
       <w:cols w:space="720"/>
       <w:docGrid w:linePitch="360"/>
     </w:sectPr>
   </w:body>
 </w:document>
+</file>
+
+<file path=word/footer1.xml><?xml version="1.0" encoding="utf-8"?>
+<w:ftr xmlns:m="http://schemas.openxmlformats.org/officeDocument/2006/math" xmlns:mc="http://schemas.openxmlformats.org/markup-compatibility/2006" xmlns:mo="http://schemas.microsoft.com/office/mac/office/2008/main" xmlns:mv="urn:schemas-microsoft-com:mac:vml" xmlns:o="urn:schemas-microsoft-com:office:office" xmlns:r="http://schemas.openxmlformats.org/officeDocument/2006/relationships" xmlns:v="urn:schemas-microsoft-com:vml" xmlns:w10="urn:schemas-microsoft-com:office:word" xmlns:w14="http://schemas.microsoft.com/office/word/2010/wordml" xmlns:w="http://schemas.openxmlformats.org/wordprocessingml/2006/main" xmlns:wne="http://schemas.microsoft.com/office/word/2006/wordml" xmlns:wp14="http://schemas.microsoft.com/office/word/2010/wordprocessingDrawing" xmlns:wp="http://schemas.openxmlformats.org/drawingml/2006/wordprocessingDrawing" xmlns:wpc="http://schemas.microsoft.com/office/word/2010/wordprocessingCanvas" xmlns:wpg="http://schemas.microsoft.com/office/word/2010/wordprocessingGroup" xmlns:wpi="http://schemas.microsoft.com/office/word/2010/wordprocessingInk" xmlns:wps="http://schemas.microsoft.com/office/word/2010/wordprocessingShape" mc:Ignorable="w14 wp14">
+  <w:p>
+    <w:pPr>
+      <w:pStyle w:val="Footer"/>
+      <w:spacing w:after="0"/>
+      <w:jc w:val="center"/>
+    </w:pPr>
+    <w:r>
+      <w:rPr>
+        <w:rFonts w:ascii="Arial" w:hAnsi="Arial" w:eastAsia="Arial"/>
+        <w:color w:val="000000"/>
+        <w:sz w:val="18"/>
+      </w:rPr>
+      <w:t xml:space="preserve">COSYNE 2027  |  </w:t>
+    </w:r>
+    <w:fldSimple w:instr="PAGE">
+      <w:r>
+        <w:rPr>
+          <w:color w:val="000000"/>
+          <w:sz w:val="18"/>
+        </w:rPr>
+        <w:t>1</w:t>
+      </w:r>
+    </w:fldSimple>
+  </w:p>
+</w:ftr>
+</file>
+
+<file path=word/footer2.xml><?xml version="1.0" encoding="utf-8"?>
+<w:ftr xmlns:m="http://schemas.openxmlformats.org/officeDocument/2006/math" xmlns:mc="http://schemas.openxmlformats.org/markup-compatibility/2006" xmlns:mo="http://schemas.microsoft.com/office/mac/office/2008/main" xmlns:mv="urn:schemas-microsoft-com:mac:vml" xmlns:o="urn:schemas-microsoft-com:office:office" xmlns:r="http://schemas.openxmlformats.org/officeDocument/2006/relationships" xmlns:v="urn:schemas-microsoft-com:vml" xmlns:w10="urn:schemas-microsoft-com:office:word" xmlns:w14="http://schemas.microsoft.com/office/word/2010/wordml" xmlns:w="http://schemas.openxmlformats.org/wordprocessingml/2006/main" xmlns:wne="http://schemas.microsoft.com/office/word/2006/wordml" xmlns:wp14="http://schemas.microsoft.com/office/word/2010/wordprocessingDrawing" xmlns:wp="http://schemas.openxmlformats.org/drawingml/2006/wordprocessingDrawing" xmlns:wpc="http://schemas.microsoft.com/office/word/2010/wordprocessingCanvas" xmlns:wpg="http://schemas.microsoft.com/office/word/2010/wordprocessingGroup" xmlns:wpi="http://schemas.microsoft.com/office/word/2010/wordprocessingInk" xmlns:wps="http://schemas.microsoft.com/office/word/2010/wordprocessingShape" mc:Ignorable="w14 wp14">
+  <w:p>
+    <w:pPr>
+      <w:pStyle w:val="Footer"/>
+    </w:pPr>
+  </w:p>
+</w:ftr>
+</file>
+
+<file path=word/footer3.xml><?xml version="1.0" encoding="utf-8"?>
+<w:ftr xmlns:m="http://schemas.openxmlformats.org/officeDocument/2006/math" xmlns:mc="http://schemas.openxmlformats.org/markup-compatibility/2006" xmlns:mo="http://schemas.microsoft.com/office/mac/office/2008/main" xmlns:mv="urn:schemas-microsoft-com:mac:vml" xmlns:o="urn:schemas-microsoft-com:office:office" xmlns:r="http://schemas.openxmlformats.org/officeDocument/2006/relationships" xmlns:v="urn:schemas-microsoft-com:vml" xmlns:w10="urn:schemas-microsoft-com:office:word" xmlns:w14="http://schemas.microsoft.com/office/word/2010/wordml" xmlns:w="http://schemas.openxmlformats.org/wordprocessingml/2006/main" xmlns:wne="http://schemas.microsoft.com/office/word/2006/wordml" xmlns:wp14="http://schemas.microsoft.com/office/word/2010/wordprocessingDrawing" xmlns:wp="http://schemas.openxmlformats.org/drawingml/2006/wordprocessingDrawing" xmlns:wpc="http://schemas.microsoft.com/office/word/2010/wordprocessingCanvas" xmlns:wpg="http://schemas.microsoft.com/office/word/2010/wordprocessingGroup" xmlns:wpi="http://schemas.microsoft.com/office/word/2010/wordprocessingInk" xmlns:wps="http://schemas.microsoft.com/office/word/2010/wordprocessingShape" mc:Ignorable="w14 wp14">
+  <w:p>
+    <w:pPr>
+      <w:pStyle w:val="Footer"/>
+    </w:pPr>
+  </w:p>
+</w:ftr>
+</file>
+
+<file path=word/header1.xml><?xml version="1.0" encoding="utf-8"?>
+<w:hdr xmlns:m="http://schemas.openxmlformats.org/officeDocument/2006/math" xmlns:mc="http://schemas.openxmlformats.org/markup-compatibility/2006" xmlns:mo="http://schemas.microsoft.com/office/mac/office/2008/main" xmlns:mv="urn:schemas-microsoft-com:mac:vml" xmlns:o="urn:schemas-microsoft-com:office:office" xmlns:r="http://schemas.openxmlformats.org/officeDocument/2006/relationships" xmlns:v="urn:schemas-microsoft-com:vml" xmlns:w10="urn:schemas-microsoft-com:office:word" xmlns:w14="http://schemas.microsoft.com/office/word/2010/wordml" xmlns:w="http://schemas.openxmlformats.org/wordprocessingml/2006/main" xmlns:wne="http://schemas.microsoft.com/office/word/2006/wordml" xmlns:wp14="http://schemas.microsoft.com/office/word/2010/wordprocessingDrawing" xmlns:wp="http://schemas.openxmlformats.org/drawingml/2006/wordprocessingDrawing" xmlns:wpc="http://schemas.microsoft.com/office/word/2010/wordprocessingCanvas" xmlns:wpg="http://schemas.microsoft.com/office/word/2010/wordprocessingGroup" xmlns:wpi="http://schemas.microsoft.com/office/word/2010/wordprocessingInk" xmlns:wps="http://schemas.microsoft.com/office/word/2010/wordprocessingShape" mc:Ignorable="w14 wp14">
+  <w:p>
+    <w:pPr>
+      <w:pStyle w:val="Header"/>
+    </w:pPr>
+  </w:p>
+</w:hdr>
+</file>
+
+<file path=word/header2.xml><?xml version="1.0" encoding="utf-8"?>
+<w:hdr xmlns:m="http://schemas.openxmlformats.org/officeDocument/2006/math" xmlns:mc="http://schemas.openxmlformats.org/markup-compatibility/2006" xmlns:mo="http://schemas.microsoft.com/office/mac/office/2008/main" xmlns:mv="urn:schemas-microsoft-com:mac:vml" xmlns:o="urn:schemas-microsoft-com:office:office" xmlns:r="http://schemas.openxmlformats.org/officeDocument/2006/relationships" xmlns:v="urn:schemas-microsoft-com:vml" xmlns:w10="urn:schemas-microsoft-com:office:word" xmlns:w14="http://schemas.microsoft.com/office/word/2010/wordml" xmlns:w="http://schemas.openxmlformats.org/wordprocessingml/2006/main" xmlns:wne="http://schemas.microsoft.com/office/word/2006/wordml" xmlns:wp14="http://schemas.microsoft.com/office/word/2010/wordprocessingDrawing" xmlns:wp="http://schemas.openxmlformats.org/drawingml/2006/wordprocessingDrawing" xmlns:wpc="http://schemas.microsoft.com/office/word/2010/wordprocessingCanvas" xmlns:wpg="http://schemas.microsoft.com/office/word/2010/wordprocessingGroup" xmlns:wpi="http://schemas.microsoft.com/office/word/2010/wordprocessingInk" xmlns:wps="http://schemas.microsoft.com/office/word/2010/wordprocessingShape" mc:Ignorable="w14 wp14">
+  <w:p>
+    <w:pPr>
+      <w:pStyle w:val="Header"/>
+    </w:pPr>
+  </w:p>
+</w:hdr>
+</file>
+
+<file path=word/header3.xml><?xml version="1.0" encoding="utf-8"?>
+<w:hdr xmlns:m="http://schemas.openxmlformats.org/officeDocument/2006/math" xmlns:mc="http://schemas.openxmlformats.org/markup-compatibility/2006" xmlns:mo="http://schemas.microsoft.com/office/mac/office/2008/main" xmlns:mv="urn:schemas-microsoft-com:mac:vml" xmlns:o="urn:schemas-microsoft-com:office:office" xmlns:r="http://schemas.openxmlformats.org/officeDocument/2006/relationships" xmlns:v="urn:schemas-microsoft-com:vml" xmlns:w10="urn:schemas-microsoft-com:office:word" xmlns:w14="http://schemas.microsoft.com/office/word/2010/wordml" xmlns:w="http://schemas.openxmlformats.org/wordprocessingml/2006/main" xmlns:wne="http://schemas.microsoft.com/office/word/2006/wordml" xmlns:wp14="http://schemas.microsoft.com/office/word/2010/wordprocessingDrawing" xmlns:wp="http://schemas.openxmlformats.org/drawingml/2006/wordprocessingDrawing" xmlns:wpc="http://schemas.microsoft.com/office/word/2010/wordprocessingCanvas" xmlns:wpg="http://schemas.microsoft.com/office/word/2010/wordprocessingGroup" xmlns:wpi="http://schemas.microsoft.com/office/word/2010/wordprocessingInk" xmlns:wps="http://schemas.microsoft.com/office/word/2010/wordprocessingShape" mc:Ignorable="w14 wp14">
+  <w:p>
+    <w:pPr>
+      <w:pStyle w:val="Header"/>
+    </w:pPr>
+  </w:p>
+</w:hdr>
 </file>
 
 <file path=word/numbering.xml><?xml version="1.0" encoding="utf-8"?>
@@ -679,7 +864,7 @@
     </w:pPr>
     <w:rPr>
       <w:rFonts w:ascii="Arial" w:hAnsi="Arial" w:eastAsia="Arial"/>
-      <w:color w:val="262B30"/>
+      <w:color w:val="000000"/>
       <w:sz w:val="24"/>
     </w:rPr>
   </w:style>
@@ -697,6 +882,10 @@
       </w:tabs>
       <w:spacing w:after="0" w:line="240" w:lineRule="auto"/>
     </w:pPr>
+    <w:rPr>
+      <w:rFonts w:ascii="Arial" w:hAnsi="Arial" w:eastAsia="Arial"/>
+      <w:color w:val="000000"/>
+    </w:rPr>
   </w:style>
   <w:style w:type="character" w:customStyle="1" w:styleId="HeaderChar">
     <w:name w:val="Header Char"/>
@@ -704,6 +893,10 @@
     <w:link w:val="Header"/>
     <w:uiPriority w:val="99"/>
     <w:rsid w:val="00E618BF"/>
+    <w:rPr>
+      <w:rFonts w:ascii="Arial" w:hAnsi="Arial" w:eastAsia="Arial"/>
+      <w:color w:val="000000"/>
+    </w:rPr>
   </w:style>
   <w:style w:type="paragraph" w:styleId="Footer">
     <w:name w:val="footer"/>
@@ -719,6 +912,10 @@
       </w:tabs>
       <w:spacing w:after="0" w:line="240" w:lineRule="auto"/>
     </w:pPr>
+    <w:rPr>
+      <w:rFonts w:ascii="Arial" w:hAnsi="Arial" w:eastAsia="Arial"/>
+      <w:color w:val="000000"/>
+    </w:rPr>
   </w:style>
   <w:style w:type="character" w:customStyle="1" w:styleId="FooterChar">
     <w:name w:val="Footer Char"/>
@@ -726,6 +923,10 @@
     <w:link w:val="Footer"/>
     <w:uiPriority w:val="99"/>
     <w:rsid w:val="00E618BF"/>
+    <w:rPr>
+      <w:rFonts w:ascii="Arial" w:hAnsi="Arial" w:eastAsia="Arial"/>
+      <w:color w:val="000000"/>
+    </w:rPr>
   </w:style>
   <w:style w:type="paragraph" w:styleId="Heading1">
     <w:name w:val="heading 1"/>
@@ -742,10 +943,10 @@
       <w:outlineLvl w:val="0"/>
     </w:pPr>
     <w:rPr>
-      <w:rFonts w:asciiTheme="majorHAnsi" w:eastAsiaTheme="majorEastAsia" w:hAnsiTheme="majorHAnsi" w:cstheme="majorBidi"/>
+      <w:rFonts w:asciiTheme="majorHAnsi" w:eastAsiaTheme="majorEastAsia" w:hAnsiTheme="majorHAnsi" w:cstheme="majorBidi" w:ascii="Arial" w:hAnsi="Arial" w:eastAsia="Arial"/>
       <w:b/>
       <w:bCs/>
-      <w:color w:val="365F91" w:themeColor="accent1" w:themeShade="BF"/>
+      <w:color w:val="000000"/>
       <w:sz w:val="28"/>
       <w:szCs w:val="28"/>
     </w:rPr>
@@ -766,10 +967,10 @@
       <w:outlineLvl w:val="1"/>
     </w:pPr>
     <w:rPr>
-      <w:rFonts w:asciiTheme="majorHAnsi" w:eastAsiaTheme="majorEastAsia" w:hAnsiTheme="majorHAnsi" w:cstheme="majorBidi"/>
+      <w:rFonts w:asciiTheme="majorHAnsi" w:eastAsiaTheme="majorEastAsia" w:hAnsiTheme="majorHAnsi" w:cstheme="majorBidi" w:ascii="Arial" w:hAnsi="Arial" w:eastAsia="Arial"/>
       <w:b/>
       <w:bCs/>
-      <w:color w:val="4F81BD" w:themeColor="accent1"/>
+      <w:color w:val="000000"/>
       <w:sz w:val="26"/>
       <w:szCs w:val="26"/>
     </w:rPr>
@@ -790,10 +991,10 @@
       <w:outlineLvl w:val="2"/>
     </w:pPr>
     <w:rPr>
-      <w:rFonts w:asciiTheme="majorHAnsi" w:eastAsiaTheme="majorEastAsia" w:hAnsiTheme="majorHAnsi" w:cstheme="majorBidi"/>
+      <w:rFonts w:asciiTheme="majorHAnsi" w:eastAsiaTheme="majorEastAsia" w:hAnsiTheme="majorHAnsi" w:cstheme="majorBidi" w:ascii="Arial" w:hAnsi="Arial" w:eastAsia="Arial"/>
       <w:b/>
       <w:bCs/>
-      <w:color w:val="4F81BD" w:themeColor="accent1"/>
+      <w:color w:val="000000"/>
     </w:rPr>
   </w:style>
   <w:style w:type="paragraph" w:styleId="Heading4">
@@ -813,12 +1014,12 @@
       <w:outlineLvl w:val="3"/>
     </w:pPr>
     <w:rPr>
-      <w:rFonts w:asciiTheme="majorHAnsi" w:eastAsiaTheme="majorEastAsia" w:hAnsiTheme="majorHAnsi" w:cstheme="majorBidi"/>
+      <w:rFonts w:asciiTheme="majorHAnsi" w:eastAsiaTheme="majorEastAsia" w:hAnsiTheme="majorHAnsi" w:cstheme="majorBidi" w:ascii="Arial" w:hAnsi="Arial" w:eastAsia="Arial"/>
       <w:b/>
       <w:bCs/>
       <w:i/>
       <w:iCs/>
-      <w:color w:val="4F81BD" w:themeColor="accent1"/>
+      <w:color w:val="000000"/>
     </w:rPr>
   </w:style>
   <w:style w:type="paragraph" w:styleId="Heading5">
@@ -838,8 +1039,8 @@
       <w:outlineLvl w:val="4"/>
     </w:pPr>
     <w:rPr>
-      <w:rFonts w:asciiTheme="majorHAnsi" w:eastAsiaTheme="majorEastAsia" w:hAnsiTheme="majorHAnsi" w:cstheme="majorBidi"/>
-      <w:color w:val="243F60" w:themeColor="accent1" w:themeShade="7F"/>
+      <w:rFonts w:asciiTheme="majorHAnsi" w:eastAsiaTheme="majorEastAsia" w:hAnsiTheme="majorHAnsi" w:cstheme="majorBidi" w:ascii="Arial" w:hAnsi="Arial" w:eastAsia="Arial"/>
+      <w:color w:val="000000"/>
     </w:rPr>
   </w:style>
   <w:style w:type="paragraph" w:styleId="Heading6">
@@ -859,10 +1060,10 @@
       <w:outlineLvl w:val="5"/>
     </w:pPr>
     <w:rPr>
-      <w:rFonts w:asciiTheme="majorHAnsi" w:eastAsiaTheme="majorEastAsia" w:hAnsiTheme="majorHAnsi" w:cstheme="majorBidi"/>
+      <w:rFonts w:asciiTheme="majorHAnsi" w:eastAsiaTheme="majorEastAsia" w:hAnsiTheme="majorHAnsi" w:cstheme="majorBidi" w:ascii="Arial" w:hAnsi="Arial" w:eastAsia="Arial"/>
       <w:i/>
       <w:iCs/>
-      <w:color w:val="243F60" w:themeColor="accent1" w:themeShade="7F"/>
+      <w:color w:val="000000"/>
     </w:rPr>
   </w:style>
   <w:style w:type="paragraph" w:styleId="Heading7">
@@ -882,10 +1083,10 @@
       <w:outlineLvl w:val="6"/>
     </w:pPr>
     <w:rPr>
-      <w:rFonts w:asciiTheme="majorHAnsi" w:eastAsiaTheme="majorEastAsia" w:hAnsiTheme="majorHAnsi" w:cstheme="majorBidi"/>
+      <w:rFonts w:asciiTheme="majorHAnsi" w:eastAsiaTheme="majorEastAsia" w:hAnsiTheme="majorHAnsi" w:cstheme="majorBidi" w:ascii="Arial" w:hAnsi="Arial" w:eastAsia="Arial"/>
       <w:i/>
       <w:iCs/>
-      <w:color w:val="404040" w:themeColor="text1" w:themeTint="BF"/>
+      <w:color w:val="000000"/>
     </w:rPr>
   </w:style>
   <w:style w:type="paragraph" w:styleId="Heading8">
@@ -905,8 +1106,8 @@
       <w:outlineLvl w:val="7"/>
     </w:pPr>
     <w:rPr>
-      <w:rFonts w:asciiTheme="majorHAnsi" w:eastAsiaTheme="majorEastAsia" w:hAnsiTheme="majorHAnsi" w:cstheme="majorBidi"/>
-      <w:color w:val="4F81BD" w:themeColor="accent1"/>
+      <w:rFonts w:asciiTheme="majorHAnsi" w:eastAsiaTheme="majorEastAsia" w:hAnsiTheme="majorHAnsi" w:cstheme="majorBidi" w:ascii="Arial" w:hAnsi="Arial" w:eastAsia="Arial"/>
+      <w:color w:val="000000"/>
       <w:sz w:val="20"/>
       <w:szCs w:val="20"/>
     </w:rPr>
@@ -928,10 +1129,10 @@
       <w:outlineLvl w:val="8"/>
     </w:pPr>
     <w:rPr>
-      <w:rFonts w:asciiTheme="majorHAnsi" w:eastAsiaTheme="majorEastAsia" w:hAnsiTheme="majorHAnsi" w:cstheme="majorBidi"/>
+      <w:rFonts w:asciiTheme="majorHAnsi" w:eastAsiaTheme="majorEastAsia" w:hAnsiTheme="majorHAnsi" w:cstheme="majorBidi" w:ascii="Arial" w:hAnsi="Arial" w:eastAsia="Arial"/>
       <w:i/>
       <w:iCs/>
-      <w:color w:val="404040" w:themeColor="text1" w:themeTint="BF"/>
+      <w:color w:val="000000"/>
       <w:sz w:val="20"/>
       <w:szCs w:val="20"/>
     </w:rPr>
@@ -941,12 +1142,20 @@
     <w:uiPriority w:val="1"/>
     <w:semiHidden/>
     <w:unhideWhenUsed/>
+    <w:rPr>
+      <w:rFonts w:ascii="Arial" w:hAnsi="Arial" w:eastAsia="Arial"/>
+      <w:color w:val="000000"/>
+    </w:rPr>
   </w:style>
   <w:style w:type="table" w:default="1" w:styleId="TableNormal">
     <w:name w:val="Normal Table"/>
     <w:uiPriority w:val="99"/>
     <w:semiHidden/>
     <w:unhideWhenUsed/>
+    <w:rPr>
+      <w:rFonts w:ascii="Arial" w:hAnsi="Arial" w:eastAsia="Arial"/>
+      <w:color w:val="000000"/>
+    </w:rPr>
     <w:tblPr>
       <w:tblInd w:w="0" w:type="dxa"/>
       <w:tblCellMar>
@@ -971,6 +1180,10 @@
     <w:pPr>
       <w:spacing w:after="0" w:line="240" w:lineRule="auto"/>
     </w:pPr>
+    <w:rPr>
+      <w:rFonts w:ascii="Arial" w:hAnsi="Arial" w:eastAsia="Arial"/>
+      <w:color w:val="000000"/>
+    </w:rPr>
   </w:style>
   <w:style w:type="character" w:customStyle="1" w:styleId="Heading1Char">
     <w:name w:val="Heading 1 Char"/>
@@ -979,10 +1192,10 @@
     <w:uiPriority w:val="9"/>
     <w:rsid w:val="00FC693F"/>
     <w:rPr>
-      <w:rFonts w:asciiTheme="majorHAnsi" w:eastAsiaTheme="majorEastAsia" w:hAnsiTheme="majorHAnsi" w:cstheme="majorBidi"/>
+      <w:rFonts w:asciiTheme="majorHAnsi" w:eastAsiaTheme="majorEastAsia" w:hAnsiTheme="majorHAnsi" w:cstheme="majorBidi" w:ascii="Arial" w:hAnsi="Arial" w:eastAsia="Arial"/>
       <w:b/>
       <w:bCs/>
-      <w:color w:val="365F91" w:themeColor="accent1" w:themeShade="BF"/>
+      <w:color w:val="000000"/>
       <w:sz w:val="28"/>
       <w:szCs w:val="28"/>
     </w:rPr>
@@ -994,10 +1207,10 @@
     <w:uiPriority w:val="9"/>
     <w:rsid w:val="00FC693F"/>
     <w:rPr>
-      <w:rFonts w:asciiTheme="majorHAnsi" w:eastAsiaTheme="majorEastAsia" w:hAnsiTheme="majorHAnsi" w:cstheme="majorBidi"/>
+      <w:rFonts w:asciiTheme="majorHAnsi" w:eastAsiaTheme="majorEastAsia" w:hAnsiTheme="majorHAnsi" w:cstheme="majorBidi" w:ascii="Arial" w:hAnsi="Arial" w:eastAsia="Arial"/>
       <w:b/>
       <w:bCs/>
-      <w:color w:val="4F81BD" w:themeColor="accent1"/>
+      <w:color w:val="000000"/>
       <w:sz w:val="26"/>
       <w:szCs w:val="26"/>
     </w:rPr>
@@ -1009,10 +1222,10 @@
     <w:uiPriority w:val="9"/>
     <w:rsid w:val="00FC693F"/>
     <w:rPr>
-      <w:rFonts w:asciiTheme="majorHAnsi" w:eastAsiaTheme="majorEastAsia" w:hAnsiTheme="majorHAnsi" w:cstheme="majorBidi"/>
+      <w:rFonts w:asciiTheme="majorHAnsi" w:eastAsiaTheme="majorEastAsia" w:hAnsiTheme="majorHAnsi" w:cstheme="majorBidi" w:ascii="Arial" w:hAnsi="Arial" w:eastAsia="Arial"/>
       <w:b/>
       <w:bCs/>
-      <w:color w:val="4F81BD" w:themeColor="accent1"/>
+      <w:color w:val="000000"/>
     </w:rPr>
   </w:style>
   <w:style w:type="paragraph" w:styleId="Title">
@@ -1031,8 +1244,8 @@
       <w:contextualSpacing/>
     </w:pPr>
     <w:rPr>
-      <w:rFonts w:asciiTheme="majorHAnsi" w:eastAsiaTheme="majorEastAsia" w:hAnsiTheme="majorHAnsi" w:cstheme="majorBidi"/>
-      <w:color w:val="17365D" w:themeColor="text2" w:themeShade="BF"/>
+      <w:rFonts w:asciiTheme="majorHAnsi" w:eastAsiaTheme="majorEastAsia" w:hAnsiTheme="majorHAnsi" w:cstheme="majorBidi" w:ascii="Arial" w:hAnsi="Arial" w:eastAsia="Arial"/>
+      <w:color w:val="000000"/>
       <w:spacing w:val="5"/>
       <w:kern w:val="28"/>
       <w:sz w:val="52"/>
@@ -1046,8 +1259,8 @@
     <w:uiPriority w:val="10"/>
     <w:rsid w:val="00FC693F"/>
     <w:rPr>
-      <w:rFonts w:asciiTheme="majorHAnsi" w:eastAsiaTheme="majorEastAsia" w:hAnsiTheme="majorHAnsi" w:cstheme="majorBidi"/>
-      <w:color w:val="17365D" w:themeColor="text2" w:themeShade="BF"/>
+      <w:rFonts w:asciiTheme="majorHAnsi" w:eastAsiaTheme="majorEastAsia" w:hAnsiTheme="majorHAnsi" w:cstheme="majorBidi" w:ascii="Arial" w:hAnsi="Arial" w:eastAsia="Arial"/>
+      <w:color w:val="000000"/>
       <w:spacing w:val="5"/>
       <w:kern w:val="28"/>
       <w:sz w:val="52"/>
@@ -1068,10 +1281,10 @@
       </w:numPr>
     </w:pPr>
     <w:rPr>
-      <w:rFonts w:asciiTheme="majorHAnsi" w:eastAsiaTheme="majorEastAsia" w:hAnsiTheme="majorHAnsi" w:cstheme="majorBidi"/>
+      <w:rFonts w:asciiTheme="majorHAnsi" w:eastAsiaTheme="majorEastAsia" w:hAnsiTheme="majorHAnsi" w:cstheme="majorBidi" w:ascii="Arial" w:hAnsi="Arial" w:eastAsia="Arial"/>
       <w:i/>
       <w:iCs/>
-      <w:color w:val="4F81BD" w:themeColor="accent1"/>
+      <w:color w:val="000000"/>
       <w:spacing w:val="15"/>
       <w:sz w:val="24"/>
       <w:szCs w:val="24"/>
@@ -1084,10 +1297,10 @@
     <w:uiPriority w:val="11"/>
     <w:rsid w:val="00FC693F"/>
     <w:rPr>
-      <w:rFonts w:asciiTheme="majorHAnsi" w:eastAsiaTheme="majorEastAsia" w:hAnsiTheme="majorHAnsi" w:cstheme="majorBidi"/>
+      <w:rFonts w:asciiTheme="majorHAnsi" w:eastAsiaTheme="majorEastAsia" w:hAnsiTheme="majorHAnsi" w:cstheme="majorBidi" w:ascii="Arial" w:hAnsi="Arial" w:eastAsia="Arial"/>
       <w:i/>
       <w:iCs/>
-      <w:color w:val="4F81BD" w:themeColor="accent1"/>
+      <w:color w:val="000000"/>
       <w:spacing w:val="15"/>
       <w:sz w:val="24"/>
       <w:szCs w:val="24"/>
@@ -1103,6 +1316,10 @@
       <w:ind w:left="720"/>
       <w:contextualSpacing/>
     </w:pPr>
+    <w:rPr>
+      <w:rFonts w:ascii="Arial" w:hAnsi="Arial" w:eastAsia="Arial"/>
+      <w:color w:val="000000"/>
+    </w:rPr>
   </w:style>
   <w:style w:type="paragraph" w:styleId="BodyText">
     <w:name w:val="Body Text"/>
@@ -1114,6 +1331,10 @@
     <w:pPr>
       <w:spacing w:after="120"/>
     </w:pPr>
+    <w:rPr>
+      <w:rFonts w:ascii="Arial" w:hAnsi="Arial" w:eastAsia="Arial"/>
+      <w:color w:val="000000"/>
+    </w:rPr>
   </w:style>
   <w:style w:type="character" w:customStyle="1" w:styleId="BodyTextChar">
     <w:name w:val="Body Text Char"/>
@@ -1121,6 +1342,10 @@
     <w:link w:val="BodyText"/>
     <w:uiPriority w:val="99"/>
     <w:rsid w:val="00AA1D8D"/>
+    <w:rPr>
+      <w:rFonts w:ascii="Arial" w:hAnsi="Arial" w:eastAsia="Arial"/>
+      <w:color w:val="000000"/>
+    </w:rPr>
   </w:style>
   <w:style w:type="paragraph" w:styleId="BodyText2">
     <w:name w:val="Body Text 2"/>
@@ -1132,6 +1357,10 @@
     <w:pPr>
       <w:spacing w:after="120" w:line="480" w:lineRule="auto"/>
     </w:pPr>
+    <w:rPr>
+      <w:rFonts w:ascii="Arial" w:hAnsi="Arial" w:eastAsia="Arial"/>
+      <w:color w:val="000000"/>
+    </w:rPr>
   </w:style>
   <w:style w:type="character" w:customStyle="1" w:styleId="BodyText2Char">
     <w:name w:val="Body Text 2 Char"/>
@@ -1139,6 +1368,10 @@
     <w:link w:val="BodyText2"/>
     <w:uiPriority w:val="99"/>
     <w:rsid w:val="00AA1D8D"/>
+    <w:rPr>
+      <w:rFonts w:ascii="Arial" w:hAnsi="Arial" w:eastAsia="Arial"/>
+      <w:color w:val="000000"/>
+    </w:rPr>
   </w:style>
   <w:style w:type="paragraph" w:styleId="BodyText3">
     <w:name w:val="Body Text 3"/>
@@ -1151,6 +1384,8 @@
       <w:spacing w:after="120"/>
     </w:pPr>
     <w:rPr>
+      <w:rFonts w:ascii="Arial" w:hAnsi="Arial" w:eastAsia="Arial"/>
+      <w:color w:val="000000"/>
       <w:sz w:val="16"/>
       <w:szCs w:val="16"/>
     </w:rPr>
@@ -1162,6 +1397,8 @@
     <w:uiPriority w:val="99"/>
     <w:rsid w:val="00AA1D8D"/>
     <w:rPr>
+      <w:rFonts w:ascii="Arial" w:hAnsi="Arial" w:eastAsia="Arial"/>
+      <w:color w:val="000000"/>
       <w:sz w:val="16"/>
       <w:szCs w:val="16"/>
     </w:rPr>
@@ -1176,6 +1413,10 @@
       <w:ind w:left="360" w:hanging="360"/>
       <w:contextualSpacing/>
     </w:pPr>
+    <w:rPr>
+      <w:rFonts w:ascii="Arial" w:hAnsi="Arial" w:eastAsia="Arial"/>
+      <w:color w:val="000000"/>
+    </w:rPr>
   </w:style>
   <w:style w:type="paragraph" w:styleId="List2">
     <w:name w:val="List 2"/>
@@ -1187,6 +1428,10 @@
       <w:ind w:left="720" w:hanging="360"/>
       <w:contextualSpacing/>
     </w:pPr>
+    <w:rPr>
+      <w:rFonts w:ascii="Arial" w:hAnsi="Arial" w:eastAsia="Arial"/>
+      <w:color w:val="000000"/>
+    </w:rPr>
   </w:style>
   <w:style w:type="paragraph" w:styleId="List3">
     <w:name w:val="List 3"/>
@@ -1198,6 +1443,10 @@
       <w:ind w:left="1080" w:hanging="360"/>
       <w:contextualSpacing/>
     </w:pPr>
+    <w:rPr>
+      <w:rFonts w:ascii="Arial" w:hAnsi="Arial" w:eastAsia="Arial"/>
+      <w:color w:val="000000"/>
+    </w:rPr>
   </w:style>
   <w:style w:type="paragraph" w:styleId="ListBullet">
     <w:name w:val="List Bullet"/>
@@ -1211,6 +1460,10 @@
       </w:numPr>
       <w:contextualSpacing/>
     </w:pPr>
+    <w:rPr>
+      <w:rFonts w:ascii="Arial" w:hAnsi="Arial" w:eastAsia="Arial"/>
+      <w:color w:val="000000"/>
+    </w:rPr>
   </w:style>
   <w:style w:type="paragraph" w:styleId="ListBullet2">
     <w:name w:val="List Bullet 2"/>
@@ -1224,6 +1477,10 @@
       </w:numPr>
       <w:contextualSpacing/>
     </w:pPr>
+    <w:rPr>
+      <w:rFonts w:ascii="Arial" w:hAnsi="Arial" w:eastAsia="Arial"/>
+      <w:color w:val="000000"/>
+    </w:rPr>
   </w:style>
   <w:style w:type="paragraph" w:styleId="ListBullet3">
     <w:name w:val="List Bullet 3"/>
@@ -1237,6 +1494,10 @@
       </w:numPr>
       <w:contextualSpacing/>
     </w:pPr>
+    <w:rPr>
+      <w:rFonts w:ascii="Arial" w:hAnsi="Arial" w:eastAsia="Arial"/>
+      <w:color w:val="000000"/>
+    </w:rPr>
   </w:style>
   <w:style w:type="paragraph" w:styleId="ListNumber">
     <w:name w:val="List Number"/>
@@ -1250,6 +1511,10 @@
       </w:numPr>
       <w:contextualSpacing/>
     </w:pPr>
+    <w:rPr>
+      <w:rFonts w:ascii="Arial" w:hAnsi="Arial" w:eastAsia="Arial"/>
+      <w:color w:val="000000"/>
+    </w:rPr>
   </w:style>
   <w:style w:type="paragraph" w:styleId="ListNumber2">
     <w:name w:val="List Number 2"/>
@@ -1263,6 +1528,10 @@
       </w:numPr>
       <w:contextualSpacing/>
     </w:pPr>
+    <w:rPr>
+      <w:rFonts w:ascii="Arial" w:hAnsi="Arial" w:eastAsia="Arial"/>
+      <w:color w:val="000000"/>
+    </w:rPr>
   </w:style>
   <w:style w:type="paragraph" w:styleId="ListNumber3">
     <w:name w:val="List Number 3"/>
@@ -1276,6 +1545,10 @@
       </w:numPr>
       <w:contextualSpacing/>
     </w:pPr>
+    <w:rPr>
+      <w:rFonts w:ascii="Arial" w:hAnsi="Arial" w:eastAsia="Arial"/>
+      <w:color w:val="000000"/>
+    </w:rPr>
   </w:style>
   <w:style w:type="paragraph" w:styleId="ListContinue">
     <w:name w:val="List Continue"/>
@@ -1288,6 +1561,10 @@
       <w:ind w:left="360"/>
       <w:contextualSpacing/>
     </w:pPr>
+    <w:rPr>
+      <w:rFonts w:ascii="Arial" w:hAnsi="Arial" w:eastAsia="Arial"/>
+      <w:color w:val="000000"/>
+    </w:rPr>
   </w:style>
   <w:style w:type="paragraph" w:styleId="ListContinue2">
     <w:name w:val="List Continue 2"/>
@@ -1300,6 +1577,10 @@
       <w:ind w:left="720"/>
       <w:contextualSpacing/>
     </w:pPr>
+    <w:rPr>
+      <w:rFonts w:ascii="Arial" w:hAnsi="Arial" w:eastAsia="Arial"/>
+      <w:color w:val="000000"/>
+    </w:rPr>
   </w:style>
   <w:style w:type="paragraph" w:styleId="ListContinue3">
     <w:name w:val="List Continue 3"/>
@@ -1312,6 +1593,10 @@
       <w:ind w:left="1080"/>
       <w:contextualSpacing/>
     </w:pPr>
+    <w:rPr>
+      <w:rFonts w:ascii="Arial" w:hAnsi="Arial" w:eastAsia="Arial"/>
+      <w:color w:val="000000"/>
+    </w:rPr>
   </w:style>
   <w:style w:type="paragraph" w:styleId="MacroText">
     <w:name w:val="macro"/>
@@ -1331,7 +1616,8 @@
       </w:tabs>
     </w:pPr>
     <w:rPr>
-      <w:rFonts w:ascii="Courier" w:hAnsi="Courier"/>
+      <w:rFonts w:ascii="Arial" w:hAnsi="Arial" w:eastAsia="Arial"/>
+      <w:color w:val="000000"/>
       <w:sz w:val="20"/>
       <w:szCs w:val="20"/>
     </w:rPr>
@@ -1343,7 +1629,8 @@
     <w:uiPriority w:val="99"/>
     <w:rsid w:val="0029639D"/>
     <w:rPr>
-      <w:rFonts w:ascii="Courier" w:hAnsi="Courier"/>
+      <w:rFonts w:ascii="Arial" w:hAnsi="Arial" w:eastAsia="Arial"/>
+      <w:color w:val="000000"/>
       <w:sz w:val="20"/>
       <w:szCs w:val="20"/>
     </w:rPr>
@@ -1357,9 +1644,10 @@
     <w:qFormat/>
     <w:rsid w:val="00FC693F"/>
     <w:rPr>
+      <w:rFonts w:ascii="Arial" w:hAnsi="Arial" w:eastAsia="Arial"/>
       <w:i/>
       <w:iCs/>
-      <w:color w:val="000000" w:themeColor="text1"/>
+      <w:color w:val="000000"/>
     </w:rPr>
   </w:style>
   <w:style w:type="character" w:customStyle="1" w:styleId="QuoteChar">
@@ -1369,9 +1657,10 @@
     <w:uiPriority w:val="29"/>
     <w:rsid w:val="00FC693F"/>
     <w:rPr>
+      <w:rFonts w:ascii="Arial" w:hAnsi="Arial" w:eastAsia="Arial"/>
       <w:i/>
       <w:iCs/>
-      <w:color w:val="000000" w:themeColor="text1"/>
+      <w:color w:val="000000"/>
     </w:rPr>
   </w:style>
   <w:style w:type="character" w:customStyle="1" w:styleId="Heading4Char">
@@ -1382,12 +1671,12 @@
     <w:semiHidden/>
     <w:rsid w:val="00FC693F"/>
     <w:rPr>
-      <w:rFonts w:asciiTheme="majorHAnsi" w:eastAsiaTheme="majorEastAsia" w:hAnsiTheme="majorHAnsi" w:cstheme="majorBidi"/>
+      <w:rFonts w:asciiTheme="majorHAnsi" w:eastAsiaTheme="majorEastAsia" w:hAnsiTheme="majorHAnsi" w:cstheme="majorBidi" w:ascii="Arial" w:hAnsi="Arial" w:eastAsia="Arial"/>
       <w:b/>
       <w:bCs/>
       <w:i/>
       <w:iCs/>
-      <w:color w:val="4F81BD" w:themeColor="accent1"/>
+      <w:color w:val="000000"/>
     </w:rPr>
   </w:style>
   <w:style w:type="character" w:customStyle="1" w:styleId="Heading5Char">
@@ -1398,8 +1687,8 @@
     <w:semiHidden/>
     <w:rsid w:val="00FC693F"/>
     <w:rPr>
-      <w:rFonts w:asciiTheme="majorHAnsi" w:eastAsiaTheme="majorEastAsia" w:hAnsiTheme="majorHAnsi" w:cstheme="majorBidi"/>
-      <w:color w:val="243F60" w:themeColor="accent1" w:themeShade="7F"/>
+      <w:rFonts w:asciiTheme="majorHAnsi" w:eastAsiaTheme="majorEastAsia" w:hAnsiTheme="majorHAnsi" w:cstheme="majorBidi" w:ascii="Arial" w:hAnsi="Arial" w:eastAsia="Arial"/>
+      <w:color w:val="000000"/>
     </w:rPr>
   </w:style>
   <w:style w:type="character" w:customStyle="1" w:styleId="Heading6Char">
@@ -1410,10 +1699,10 @@
     <w:semiHidden/>
     <w:rsid w:val="00FC693F"/>
     <w:rPr>
-      <w:rFonts w:asciiTheme="majorHAnsi" w:eastAsiaTheme="majorEastAsia" w:hAnsiTheme="majorHAnsi" w:cstheme="majorBidi"/>
+      <w:rFonts w:asciiTheme="majorHAnsi" w:eastAsiaTheme="majorEastAsia" w:hAnsiTheme="majorHAnsi" w:cstheme="majorBidi" w:ascii="Arial" w:hAnsi="Arial" w:eastAsia="Arial"/>
       <w:i/>
       <w:iCs/>
-      <w:color w:val="243F60" w:themeColor="accent1" w:themeShade="7F"/>
+      <w:color w:val="000000"/>
     </w:rPr>
   </w:style>
   <w:style w:type="character" w:customStyle="1" w:styleId="Heading7Char">
@@ -1424,10 +1713,10 @@
     <w:semiHidden/>
     <w:rsid w:val="00FC693F"/>
     <w:rPr>
-      <w:rFonts w:asciiTheme="majorHAnsi" w:eastAsiaTheme="majorEastAsia" w:hAnsiTheme="majorHAnsi" w:cstheme="majorBidi"/>
+      <w:rFonts w:asciiTheme="majorHAnsi" w:eastAsiaTheme="majorEastAsia" w:hAnsiTheme="majorHAnsi" w:cstheme="majorBidi" w:ascii="Arial" w:hAnsi="Arial" w:eastAsia="Arial"/>
       <w:i/>
       <w:iCs/>
-      <w:color w:val="404040" w:themeColor="text1" w:themeTint="BF"/>
+      <w:color w:val="000000"/>
     </w:rPr>
   </w:style>
   <w:style w:type="character" w:customStyle="1" w:styleId="Heading8Char">
@@ -1438,8 +1727,8 @@
     <w:semiHidden/>
     <w:rsid w:val="00FC693F"/>
     <w:rPr>
-      <w:rFonts w:asciiTheme="majorHAnsi" w:eastAsiaTheme="majorEastAsia" w:hAnsiTheme="majorHAnsi" w:cstheme="majorBidi"/>
-      <w:color w:val="4F81BD" w:themeColor="accent1"/>
+      <w:rFonts w:asciiTheme="majorHAnsi" w:eastAsiaTheme="majorEastAsia" w:hAnsiTheme="majorHAnsi" w:cstheme="majorBidi" w:ascii="Arial" w:hAnsi="Arial" w:eastAsia="Arial"/>
+      <w:color w:val="000000"/>
       <w:sz w:val="20"/>
       <w:szCs w:val="20"/>
     </w:rPr>
@@ -1452,10 +1741,10 @@
     <w:semiHidden/>
     <w:rsid w:val="00FC693F"/>
     <w:rPr>
-      <w:rFonts w:asciiTheme="majorHAnsi" w:eastAsiaTheme="majorEastAsia" w:hAnsiTheme="majorHAnsi" w:cstheme="majorBidi"/>
+      <w:rFonts w:asciiTheme="majorHAnsi" w:eastAsiaTheme="majorEastAsia" w:hAnsiTheme="majorHAnsi" w:cstheme="majorBidi" w:ascii="Arial" w:hAnsi="Arial" w:eastAsia="Arial"/>
       <w:i/>
       <w:iCs/>
-      <w:color w:val="404040" w:themeColor="text1" w:themeTint="BF"/>
+      <w:color w:val="000000"/>
       <w:sz w:val="20"/>
       <w:szCs w:val="20"/>
     </w:rPr>
@@ -1473,9 +1762,10 @@
       <w:spacing w:line="240" w:lineRule="auto"/>
     </w:pPr>
     <w:rPr>
+      <w:rFonts w:ascii="Arial" w:hAnsi="Arial" w:eastAsia="Arial"/>
       <w:b/>
       <w:bCs/>
-      <w:color w:val="4F81BD" w:themeColor="accent1"/>
+      <w:color w:val="000000"/>
       <w:sz w:val="18"/>
       <w:szCs w:val="18"/>
     </w:rPr>
@@ -1487,8 +1777,10 @@
     <w:qFormat/>
     <w:rsid w:val="00FC693F"/>
     <w:rPr>
+      <w:rFonts w:ascii="Arial" w:hAnsi="Arial" w:eastAsia="Arial"/>
       <w:b/>
       <w:bCs/>
+      <w:color w:val="000000"/>
     </w:rPr>
   </w:style>
   <w:style w:type="character" w:styleId="Emphasis">
@@ -1498,8 +1790,10 @@
     <w:qFormat/>
     <w:rsid w:val="00FC693F"/>
     <w:rPr>
+      <w:rFonts w:ascii="Arial" w:hAnsi="Arial" w:eastAsia="Arial"/>
       <w:i/>
       <w:iCs/>
+      <w:color w:val="000000"/>
     </w:rPr>
   </w:style>
   <w:style w:type="paragraph" w:styleId="IntenseQuote">
@@ -1518,11 +1812,12 @@
       <w:ind w:left="936" w:right="936"/>
     </w:pPr>
     <w:rPr>
+      <w:rFonts w:ascii="Arial" w:hAnsi="Arial" w:eastAsia="Arial"/>
       <w:b/>
       <w:bCs/>
       <w:i/>
       <w:iCs/>
-      <w:color w:val="4F81BD" w:themeColor="accent1"/>
+      <w:color w:val="000000"/>
     </w:rPr>
   </w:style>
   <w:style w:type="character" w:customStyle="1" w:styleId="IntenseQuoteChar">
@@ -1532,11 +1827,12 @@
     <w:uiPriority w:val="30"/>
     <w:rsid w:val="00FC693F"/>
     <w:rPr>
+      <w:rFonts w:ascii="Arial" w:hAnsi="Arial" w:eastAsia="Arial"/>
       <w:b/>
       <w:bCs/>
       <w:i/>
       <w:iCs/>
-      <w:color w:val="4F81BD" w:themeColor="accent1"/>
+      <w:color w:val="000000"/>
     </w:rPr>
   </w:style>
   <w:style w:type="character" w:styleId="SubtleEmphasis">
@@ -1546,9 +1842,10 @@
     <w:qFormat/>
     <w:rsid w:val="00FC693F"/>
     <w:rPr>
+      <w:rFonts w:ascii="Arial" w:hAnsi="Arial" w:eastAsia="Arial"/>
       <w:i/>
       <w:iCs/>
-      <w:color w:val="808080" w:themeColor="text1" w:themeTint="7F"/>
+      <w:color w:val="000000"/>
     </w:rPr>
   </w:style>
   <w:style w:type="character" w:styleId="IntenseEmphasis">
@@ -1558,11 +1855,12 @@
     <w:qFormat/>
     <w:rsid w:val="00FC693F"/>
     <w:rPr>
+      <w:rFonts w:ascii="Arial" w:hAnsi="Arial" w:eastAsia="Arial"/>
       <w:b/>
       <w:bCs/>
       <w:i/>
       <w:iCs/>
-      <w:color w:val="4F81BD" w:themeColor="accent1"/>
+      <w:color w:val="000000"/>
     </w:rPr>
   </w:style>
   <w:style w:type="character" w:styleId="SubtleReference">
@@ -1572,8 +1870,9 @@
     <w:qFormat/>
     <w:rsid w:val="00FC693F"/>
     <w:rPr>
+      <w:rFonts w:ascii="Arial" w:hAnsi="Arial" w:eastAsia="Arial"/>
       <w:smallCaps/>
-      <w:color w:val="C0504D" w:themeColor="accent2"/>
+      <w:color w:val="000000"/>
       <w:u w:val="single"/>
     </w:rPr>
   </w:style>
@@ -1584,10 +1883,11 @@
     <w:qFormat/>
     <w:rsid w:val="00FC693F"/>
     <w:rPr>
+      <w:rFonts w:ascii="Arial" w:hAnsi="Arial" w:eastAsia="Arial"/>
       <w:b/>
       <w:bCs/>
       <w:smallCaps/>
-      <w:color w:val="C0504D" w:themeColor="accent2"/>
+      <w:color w:val="000000"/>
       <w:spacing w:val="5"/>
       <w:u w:val="single"/>
     </w:rPr>
@@ -1599,9 +1899,11 @@
     <w:qFormat/>
     <w:rsid w:val="00FC693F"/>
     <w:rPr>
+      <w:rFonts w:ascii="Arial" w:hAnsi="Arial" w:eastAsia="Arial"/>
       <w:b/>
       <w:bCs/>
       <w:smallCaps/>
+      <w:color w:val="000000"/>
       <w:spacing w:val="5"/>
     </w:rPr>
   </w:style>
@@ -1617,6 +1919,10 @@
     <w:pPr>
       <w:outlineLvl w:val="9"/>
     </w:pPr>
+    <w:rPr>
+      <w:rFonts w:ascii="Arial" w:hAnsi="Arial" w:eastAsia="Arial"/>
+      <w:color w:val="000000"/>
+    </w:rPr>
   </w:style>
   <w:style w:type="table" w:styleId="TableGrid">
     <w:name w:val="Table Grid"/>
@@ -1626,6 +1932,10 @@
     <w:pPr>
       <w:spacing w:after="0" w:line="240" w:lineRule="auto"/>
     </w:pPr>
+    <w:rPr>
+      <w:rFonts w:ascii="Arial" w:hAnsi="Arial" w:eastAsia="Arial"/>
+      <w:color w:val="000000"/>
+    </w:rPr>
     <w:tblPr>
       <w:tblInd w:w="0" w:type="dxa"/>
       <w:tblBorders>
@@ -1653,7 +1963,8 @@
       <w:spacing w:after="0" w:line="240" w:lineRule="auto"/>
     </w:pPr>
     <w:rPr>
-      <w:color w:val="000000" w:themeColor="text1" w:themeShade="BF"/>
+      <w:rFonts w:ascii="Arial" w:hAnsi="Arial" w:eastAsia="Arial"/>
+      <w:color w:val="000000"/>
     </w:rPr>
     <w:tblPr>
       <w:tblStyleRowBandSize w:val="1"/>
@@ -1756,7 +2067,8 @@
       <w:spacing w:after="0" w:line="240" w:lineRule="auto"/>
     </w:pPr>
     <w:rPr>
-      <w:color w:val="365F91" w:themeColor="accent1" w:themeShade="BF"/>
+      <w:rFonts w:ascii="Arial" w:hAnsi="Arial" w:eastAsia="Arial"/>
+      <w:color w:val="000000"/>
     </w:rPr>
     <w:tblPr>
       <w:tblStyleRowBandSize w:val="1"/>
@@ -1859,7 +2171,8 @@
       <w:spacing w:after="0" w:line="240" w:lineRule="auto"/>
     </w:pPr>
     <w:rPr>
-      <w:color w:val="943634" w:themeColor="accent2" w:themeShade="BF"/>
+      <w:rFonts w:ascii="Arial" w:hAnsi="Arial" w:eastAsia="Arial"/>
+      <w:color w:val="000000"/>
     </w:rPr>
     <w:tblPr>
       <w:tblStyleRowBandSize w:val="1"/>
@@ -1962,7 +2275,8 @@
       <w:spacing w:after="0" w:line="240" w:lineRule="auto"/>
     </w:pPr>
     <w:rPr>
-      <w:color w:val="76923C" w:themeColor="accent3" w:themeShade="BF"/>
+      <w:rFonts w:ascii="Arial" w:hAnsi="Arial" w:eastAsia="Arial"/>
+      <w:color w:val="000000"/>
     </w:rPr>
     <w:tblPr>
       <w:tblStyleRowBandSize w:val="1"/>
@@ -2065,7 +2379,8 @@
       <w:spacing w:after="0" w:line="240" w:lineRule="auto"/>
     </w:pPr>
     <w:rPr>
-      <w:color w:val="5F497A" w:themeColor="accent4" w:themeShade="BF"/>
+      <w:rFonts w:ascii="Arial" w:hAnsi="Arial" w:eastAsia="Arial"/>
+      <w:color w:val="000000"/>
     </w:rPr>
     <w:tblPr>
       <w:tblStyleRowBandSize w:val="1"/>
@@ -2168,7 +2483,8 @@
       <w:spacing w:after="0" w:line="240" w:lineRule="auto"/>
     </w:pPr>
     <w:rPr>
-      <w:color w:val="31849B" w:themeColor="accent5" w:themeShade="BF"/>
+      <w:rFonts w:ascii="Arial" w:hAnsi="Arial" w:eastAsia="Arial"/>
+      <w:color w:val="000000"/>
     </w:rPr>
     <w:tblPr>
       <w:tblStyleRowBandSize w:val="1"/>
@@ -2271,7 +2587,8 @@
       <w:spacing w:after="0" w:line="240" w:lineRule="auto"/>
     </w:pPr>
     <w:rPr>
-      <w:color w:val="E36C0A" w:themeColor="accent6" w:themeShade="BF"/>
+      <w:rFonts w:ascii="Arial" w:hAnsi="Arial" w:eastAsia="Arial"/>
+      <w:color w:val="000000"/>
     </w:rPr>
     <w:tblPr>
       <w:tblStyleRowBandSize w:val="1"/>
@@ -2373,6 +2690,10 @@
     <w:pPr>
       <w:spacing w:after="0" w:line="240" w:lineRule="auto"/>
     </w:pPr>
+    <w:rPr>
+      <w:rFonts w:ascii="Arial" w:hAnsi="Arial" w:eastAsia="Arial"/>
+      <w:color w:val="000000"/>
+    </w:rPr>
     <w:tblPr>
       <w:tblStyleRowBandSize w:val="1"/>
       <w:tblStyleColBandSize w:val="1"/>
@@ -2465,6 +2786,10 @@
     <w:pPr>
       <w:spacing w:after="0" w:line="240" w:lineRule="auto"/>
     </w:pPr>
+    <w:rPr>
+      <w:rFonts w:ascii="Arial" w:hAnsi="Arial" w:eastAsia="Arial"/>
+      <w:color w:val="000000"/>
+    </w:rPr>
     <w:tblPr>
       <w:tblStyleRowBandSize w:val="1"/>
       <w:tblStyleColBandSize w:val="1"/>
@@ -2557,6 +2882,10 @@
     <w:pPr>
       <w:spacing w:after="0" w:line="240" w:lineRule="auto"/>
     </w:pPr>
+    <w:rPr>
+      <w:rFonts w:ascii="Arial" w:hAnsi="Arial" w:eastAsia="Arial"/>
+      <w:color w:val="000000"/>
+    </w:rPr>
     <w:tblPr>
       <w:tblStyleRowBandSize w:val="1"/>
       <w:tblStyleColBandSize w:val="1"/>
@@ -2649,6 +2978,10 @@
     <w:pPr>
       <w:spacing w:after="0" w:line="240" w:lineRule="auto"/>
     </w:pPr>
+    <w:rPr>
+      <w:rFonts w:ascii="Arial" w:hAnsi="Arial" w:eastAsia="Arial"/>
+      <w:color w:val="000000"/>
+    </w:rPr>
     <w:tblPr>
       <w:tblStyleRowBandSize w:val="1"/>
       <w:tblStyleColBandSize w:val="1"/>
@@ -2741,6 +3074,10 @@
     <w:pPr>
       <w:spacing w:after="0" w:line="240" w:lineRule="auto"/>
     </w:pPr>
+    <w:rPr>
+      <w:rFonts w:ascii="Arial" w:hAnsi="Arial" w:eastAsia="Arial"/>
+      <w:color w:val="000000"/>
+    </w:rPr>
     <w:tblPr>
       <w:tblStyleRowBandSize w:val="1"/>
       <w:tblStyleColBandSize w:val="1"/>
@@ -2833,6 +3170,10 @@
     <w:pPr>
       <w:spacing w:after="0" w:line="240" w:lineRule="auto"/>
     </w:pPr>
+    <w:rPr>
+      <w:rFonts w:ascii="Arial" w:hAnsi="Arial" w:eastAsia="Arial"/>
+      <w:color w:val="000000"/>
+    </w:rPr>
     <w:tblPr>
       <w:tblStyleRowBandSize w:val="1"/>
       <w:tblStyleColBandSize w:val="1"/>
@@ -2925,6 +3266,10 @@
     <w:pPr>
       <w:spacing w:after="0" w:line="240" w:lineRule="auto"/>
     </w:pPr>
+    <w:rPr>
+      <w:rFonts w:ascii="Arial" w:hAnsi="Arial" w:eastAsia="Arial"/>
+      <w:color w:val="000000"/>
+    </w:rPr>
     <w:tblPr>
       <w:tblStyleRowBandSize w:val="1"/>
       <w:tblStyleColBandSize w:val="1"/>
@@ -3017,6 +3362,10 @@
     <w:pPr>
       <w:spacing w:after="0" w:line="240" w:lineRule="auto"/>
     </w:pPr>
+    <w:rPr>
+      <w:rFonts w:ascii="Arial" w:hAnsi="Arial" w:eastAsia="Arial"/>
+      <w:color w:val="000000"/>
+    </w:rPr>
     <w:tblPr>
       <w:tblStyleRowBandSize w:val="1"/>
       <w:tblStyleColBandSize w:val="1"/>
@@ -3147,6 +3496,10 @@
     <w:pPr>
       <w:spacing w:after="0" w:line="240" w:lineRule="auto"/>
     </w:pPr>
+    <w:rPr>
+      <w:rFonts w:ascii="Arial" w:hAnsi="Arial" w:eastAsia="Arial"/>
+      <w:color w:val="000000"/>
+    </w:rPr>
     <w:tblPr>
       <w:tblStyleRowBandSize w:val="1"/>
       <w:tblStyleColBandSize w:val="1"/>
@@ -3277,6 +3630,10 @@
     <w:pPr>
       <w:spacing w:after="0" w:line="240" w:lineRule="auto"/>
     </w:pPr>
+    <w:rPr>
+      <w:rFonts w:ascii="Arial" w:hAnsi="Arial" w:eastAsia="Arial"/>
+      <w:color w:val="000000"/>
+    </w:rPr>
     <w:tblPr>
       <w:tblStyleRowBandSize w:val="1"/>
       <w:tblStyleColBandSize w:val="1"/>
@@ -3407,6 +3764,10 @@
     <w:pPr>
       <w:spacing w:after="0" w:line="240" w:lineRule="auto"/>
     </w:pPr>
+    <w:rPr>
+      <w:rFonts w:ascii="Arial" w:hAnsi="Arial" w:eastAsia="Arial"/>
+      <w:color w:val="000000"/>
+    </w:rPr>
     <w:tblPr>
       <w:tblStyleRowBandSize w:val="1"/>
       <w:tblStyleColBandSize w:val="1"/>
@@ -3537,6 +3898,10 @@
     <w:pPr>
       <w:spacing w:after="0" w:line="240" w:lineRule="auto"/>
     </w:pPr>
+    <w:rPr>
+      <w:rFonts w:ascii="Arial" w:hAnsi="Arial" w:eastAsia="Arial"/>
+      <w:color w:val="000000"/>
+    </w:rPr>
     <w:tblPr>
       <w:tblStyleRowBandSize w:val="1"/>
       <w:tblStyleColBandSize w:val="1"/>
@@ -3667,6 +4032,10 @@
     <w:pPr>
       <w:spacing w:after="0" w:line="240" w:lineRule="auto"/>
     </w:pPr>
+    <w:rPr>
+      <w:rFonts w:ascii="Arial" w:hAnsi="Arial" w:eastAsia="Arial"/>
+      <w:color w:val="000000"/>
+    </w:rPr>
     <w:tblPr>
       <w:tblStyleRowBandSize w:val="1"/>
       <w:tblStyleColBandSize w:val="1"/>
@@ -3797,6 +4166,10 @@
     <w:pPr>
       <w:spacing w:after="0" w:line="240" w:lineRule="auto"/>
     </w:pPr>
+    <w:rPr>
+      <w:rFonts w:ascii="Arial" w:hAnsi="Arial" w:eastAsia="Arial"/>
+      <w:color w:val="000000"/>
+    </w:rPr>
     <w:tblPr>
       <w:tblStyleRowBandSize w:val="1"/>
       <w:tblStyleColBandSize w:val="1"/>
@@ -3927,6 +4300,10 @@
     <w:pPr>
       <w:spacing w:after="0" w:line="240" w:lineRule="auto"/>
     </w:pPr>
+    <w:rPr>
+      <w:rFonts w:ascii="Arial" w:hAnsi="Arial" w:eastAsia="Arial"/>
+      <w:color w:val="000000"/>
+    </w:rPr>
     <w:tblPr>
       <w:tblStyleRowBandSize w:val="1"/>
       <w:tblStyleColBandSize w:val="1"/>
@@ -4033,6 +4410,10 @@
     <w:pPr>
       <w:spacing w:after="0" w:line="240" w:lineRule="auto"/>
     </w:pPr>
+    <w:rPr>
+      <w:rFonts w:ascii="Arial" w:hAnsi="Arial" w:eastAsia="Arial"/>
+      <w:color w:val="000000"/>
+    </w:rPr>
     <w:tblPr>
       <w:tblStyleRowBandSize w:val="1"/>
       <w:tblStyleColBandSize w:val="1"/>
@@ -4139,6 +4520,10 @@
     <w:pPr>
       <w:spacing w:after="0" w:line="240" w:lineRule="auto"/>
     </w:pPr>
+    <w:rPr>
+      <w:rFonts w:ascii="Arial" w:hAnsi="Arial" w:eastAsia="Arial"/>
+      <w:color w:val="000000"/>
+    </w:rPr>
     <w:tblPr>
       <w:tblStyleRowBandSize w:val="1"/>
       <w:tblStyleColBandSize w:val="1"/>
@@ -4245,6 +4630,10 @@
     <w:pPr>
       <w:spacing w:after="0" w:line="240" w:lineRule="auto"/>
     </w:pPr>
+    <w:rPr>
+      <w:rFonts w:ascii="Arial" w:hAnsi="Arial" w:eastAsia="Arial"/>
+      <w:color w:val="000000"/>
+    </w:rPr>
     <w:tblPr>
       <w:tblStyleRowBandSize w:val="1"/>
       <w:tblStyleColBandSize w:val="1"/>
@@ -4351,6 +4740,10 @@
     <w:pPr>
       <w:spacing w:after="0" w:line="240" w:lineRule="auto"/>
     </w:pPr>
+    <w:rPr>
+      <w:rFonts w:ascii="Arial" w:hAnsi="Arial" w:eastAsia="Arial"/>
+      <w:color w:val="000000"/>
+    </w:rPr>
     <w:tblPr>
       <w:tblStyleRowBandSize w:val="1"/>
       <w:tblStyleColBandSize w:val="1"/>
@@ -4457,6 +4850,10 @@
     <w:pPr>
       <w:spacing w:after="0" w:line="240" w:lineRule="auto"/>
     </w:pPr>
+    <w:rPr>
+      <w:rFonts w:ascii="Arial" w:hAnsi="Arial" w:eastAsia="Arial"/>
+      <w:color w:val="000000"/>
+    </w:rPr>
     <w:tblPr>
       <w:tblStyleRowBandSize w:val="1"/>
       <w:tblStyleColBandSize w:val="1"/>
@@ -4563,6 +4960,10 @@
     <w:pPr>
       <w:spacing w:after="0" w:line="240" w:lineRule="auto"/>
     </w:pPr>
+    <w:rPr>
+      <w:rFonts w:ascii="Arial" w:hAnsi="Arial" w:eastAsia="Arial"/>
+      <w:color w:val="000000"/>
+    </w:rPr>
     <w:tblPr>
       <w:tblStyleRowBandSize w:val="1"/>
       <w:tblStyleColBandSize w:val="1"/>
@@ -4669,6 +5070,10 @@
     <w:pPr>
       <w:spacing w:after="0" w:line="240" w:lineRule="auto"/>
     </w:pPr>
+    <w:rPr>
+      <w:rFonts w:ascii="Arial" w:hAnsi="Arial" w:eastAsia="Arial"/>
+      <w:color w:val="000000"/>
+    </w:rPr>
     <w:tblPr>
       <w:tblStyleRowBandSize w:val="1"/>
       <w:tblStyleColBandSize w:val="1"/>
@@ -4818,6 +5223,10 @@
     <w:pPr>
       <w:spacing w:after="0" w:line="240" w:lineRule="auto"/>
     </w:pPr>
+    <w:rPr>
+      <w:rFonts w:ascii="Arial" w:hAnsi="Arial" w:eastAsia="Arial"/>
+      <w:color w:val="000000"/>
+    </w:rPr>
     <w:tblPr>
       <w:tblStyleRowBandSize w:val="1"/>
       <w:tblStyleColBandSize w:val="1"/>
@@ -4967,6 +5376,10 @@
     <w:pPr>
       <w:spacing w:after="0" w:line="240" w:lineRule="auto"/>
     </w:pPr>
+    <w:rPr>
+      <w:rFonts w:ascii="Arial" w:hAnsi="Arial" w:eastAsia="Arial"/>
+      <w:color w:val="000000"/>
+    </w:rPr>
     <w:tblPr>
       <w:tblStyleRowBandSize w:val="1"/>
       <w:tblStyleColBandSize w:val="1"/>
@@ -5116,6 +5529,10 @@
     <w:pPr>
       <w:spacing w:after="0" w:line="240" w:lineRule="auto"/>
     </w:pPr>
+    <w:rPr>
+      <w:rFonts w:ascii="Arial" w:hAnsi="Arial" w:eastAsia="Arial"/>
+      <w:color w:val="000000"/>
+    </w:rPr>
     <w:tblPr>
       <w:tblStyleRowBandSize w:val="1"/>
       <w:tblStyleColBandSize w:val="1"/>
@@ -5265,6 +5682,10 @@
     <w:pPr>
       <w:spacing w:after="0" w:line="240" w:lineRule="auto"/>
     </w:pPr>
+    <w:rPr>
+      <w:rFonts w:ascii="Arial" w:hAnsi="Arial" w:eastAsia="Arial"/>
+      <w:color w:val="000000"/>
+    </w:rPr>
     <w:tblPr>
       <w:tblStyleRowBandSize w:val="1"/>
       <w:tblStyleColBandSize w:val="1"/>
@@ -5414,6 +5835,10 @@
     <w:pPr>
       <w:spacing w:after="0" w:line="240" w:lineRule="auto"/>
     </w:pPr>
+    <w:rPr>
+      <w:rFonts w:ascii="Arial" w:hAnsi="Arial" w:eastAsia="Arial"/>
+      <w:color w:val="000000"/>
+    </w:rPr>
     <w:tblPr>
       <w:tblStyleRowBandSize w:val="1"/>
       <w:tblStyleColBandSize w:val="1"/>
@@ -5563,6 +5988,10 @@
     <w:pPr>
       <w:spacing w:after="0" w:line="240" w:lineRule="auto"/>
     </w:pPr>
+    <w:rPr>
+      <w:rFonts w:ascii="Arial" w:hAnsi="Arial" w:eastAsia="Arial"/>
+      <w:color w:val="000000"/>
+    </w:rPr>
     <w:tblPr>
       <w:tblStyleRowBandSize w:val="1"/>
       <w:tblStyleColBandSize w:val="1"/>
@@ -5713,7 +6142,8 @@
       <w:spacing w:after="0" w:line="240" w:lineRule="auto"/>
     </w:pPr>
     <w:rPr>
-      <w:color w:val="000000" w:themeColor="text1"/>
+      <w:rFonts w:ascii="Arial" w:hAnsi="Arial" w:eastAsia="Arial"/>
+      <w:color w:val="000000"/>
     </w:rPr>
     <w:tblPr>
       <w:tblStyleRowBandSize w:val="1"/>
@@ -5797,7 +6227,8 @@
       <w:spacing w:after="0" w:line="240" w:lineRule="auto"/>
     </w:pPr>
     <w:rPr>
-      <w:color w:val="000000" w:themeColor="text1"/>
+      <w:rFonts w:ascii="Arial" w:hAnsi="Arial" w:eastAsia="Arial"/>
+      <w:color w:val="000000"/>
     </w:rPr>
     <w:tblPr>
       <w:tblStyleRowBandSize w:val="1"/>
@@ -5881,7 +6312,8 @@
       <w:spacing w:after="0" w:line="240" w:lineRule="auto"/>
     </w:pPr>
     <w:rPr>
-      <w:color w:val="000000" w:themeColor="text1"/>
+      <w:rFonts w:ascii="Arial" w:hAnsi="Arial" w:eastAsia="Arial"/>
+      <w:color w:val="000000"/>
     </w:rPr>
     <w:tblPr>
       <w:tblStyleRowBandSize w:val="1"/>
@@ -5965,7 +6397,8 @@
       <w:spacing w:after="0" w:line="240" w:lineRule="auto"/>
     </w:pPr>
     <w:rPr>
-      <w:color w:val="000000" w:themeColor="text1"/>
+      <w:rFonts w:ascii="Arial" w:hAnsi="Arial" w:eastAsia="Arial"/>
+      <w:color w:val="000000"/>
     </w:rPr>
     <w:tblPr>
       <w:tblStyleRowBandSize w:val="1"/>
@@ -6049,7 +6482,8 @@
       <w:spacing w:after="0" w:line="240" w:lineRule="auto"/>
     </w:pPr>
     <w:rPr>
-      <w:color w:val="000000" w:themeColor="text1"/>
+      <w:rFonts w:ascii="Arial" w:hAnsi="Arial" w:eastAsia="Arial"/>
+      <w:color w:val="000000"/>
     </w:rPr>
     <w:tblPr>
       <w:tblStyleRowBandSize w:val="1"/>
@@ -6133,7 +6567,8 @@
       <w:spacing w:after="0" w:line="240" w:lineRule="auto"/>
     </w:pPr>
     <w:rPr>
-      <w:color w:val="000000" w:themeColor="text1"/>
+      <w:rFonts w:ascii="Arial" w:hAnsi="Arial" w:eastAsia="Arial"/>
+      <w:color w:val="000000"/>
     </w:rPr>
     <w:tblPr>
       <w:tblStyleRowBandSize w:val="1"/>
@@ -6217,7 +6652,8 @@
       <w:spacing w:after="0" w:line="240" w:lineRule="auto"/>
     </w:pPr>
     <w:rPr>
-      <w:color w:val="000000" w:themeColor="text1"/>
+      <w:rFonts w:ascii="Arial" w:hAnsi="Arial" w:eastAsia="Arial"/>
+      <w:color w:val="000000"/>
     </w:rPr>
     <w:tblPr>
       <w:tblStyleRowBandSize w:val="1"/>
@@ -6301,8 +6737,8 @@
       <w:spacing w:after="0" w:line="240" w:lineRule="auto"/>
     </w:pPr>
     <w:rPr>
-      <w:rFonts w:asciiTheme="majorHAnsi" w:eastAsiaTheme="majorEastAsia" w:hAnsiTheme="majorHAnsi" w:cstheme="majorBidi"/>
-      <w:color w:val="000000" w:themeColor="text1"/>
+      <w:rFonts w:asciiTheme="majorHAnsi" w:eastAsiaTheme="majorEastAsia" w:hAnsiTheme="majorHAnsi" w:cstheme="majorBidi" w:ascii="Arial" w:hAnsi="Arial" w:eastAsia="Arial"/>
+      <w:color w:val="000000"/>
     </w:rPr>
     <w:tblPr>
       <w:tblStyleRowBandSize w:val="1"/>
@@ -6429,8 +6865,8 @@
       <w:spacing w:after="0" w:line="240" w:lineRule="auto"/>
     </w:pPr>
     <w:rPr>
-      <w:rFonts w:asciiTheme="majorHAnsi" w:eastAsiaTheme="majorEastAsia" w:hAnsiTheme="majorHAnsi" w:cstheme="majorBidi"/>
-      <w:color w:val="000000" w:themeColor="text1"/>
+      <w:rFonts w:asciiTheme="majorHAnsi" w:eastAsiaTheme="majorEastAsia" w:hAnsiTheme="majorHAnsi" w:cstheme="majorBidi" w:ascii="Arial" w:hAnsi="Arial" w:eastAsia="Arial"/>
+      <w:color w:val="000000"/>
     </w:rPr>
     <w:tblPr>
       <w:tblStyleRowBandSize w:val="1"/>
@@ -6557,8 +6993,8 @@
       <w:spacing w:after="0" w:line="240" w:lineRule="auto"/>
     </w:pPr>
     <w:rPr>
-      <w:rFonts w:asciiTheme="majorHAnsi" w:eastAsiaTheme="majorEastAsia" w:hAnsiTheme="majorHAnsi" w:cstheme="majorBidi"/>
-      <w:color w:val="000000" w:themeColor="text1"/>
+      <w:rFonts w:asciiTheme="majorHAnsi" w:eastAsiaTheme="majorEastAsia" w:hAnsiTheme="majorHAnsi" w:cstheme="majorBidi" w:ascii="Arial" w:hAnsi="Arial" w:eastAsia="Arial"/>
+      <w:color w:val="000000"/>
     </w:rPr>
     <w:tblPr>
       <w:tblStyleRowBandSize w:val="1"/>
@@ -6685,8 +7121,8 @@
       <w:spacing w:after="0" w:line="240" w:lineRule="auto"/>
     </w:pPr>
     <w:rPr>
-      <w:rFonts w:asciiTheme="majorHAnsi" w:eastAsiaTheme="majorEastAsia" w:hAnsiTheme="majorHAnsi" w:cstheme="majorBidi"/>
-      <w:color w:val="000000" w:themeColor="text1"/>
+      <w:rFonts w:asciiTheme="majorHAnsi" w:eastAsiaTheme="majorEastAsia" w:hAnsiTheme="majorHAnsi" w:cstheme="majorBidi" w:ascii="Arial" w:hAnsi="Arial" w:eastAsia="Arial"/>
+      <w:color w:val="000000"/>
     </w:rPr>
     <w:tblPr>
       <w:tblStyleRowBandSize w:val="1"/>
@@ -6813,8 +7249,8 @@
       <w:spacing w:after="0" w:line="240" w:lineRule="auto"/>
     </w:pPr>
     <w:rPr>
-      <w:rFonts w:asciiTheme="majorHAnsi" w:eastAsiaTheme="majorEastAsia" w:hAnsiTheme="majorHAnsi" w:cstheme="majorBidi"/>
-      <w:color w:val="000000" w:themeColor="text1"/>
+      <w:rFonts w:asciiTheme="majorHAnsi" w:eastAsiaTheme="majorEastAsia" w:hAnsiTheme="majorHAnsi" w:cstheme="majorBidi" w:ascii="Arial" w:hAnsi="Arial" w:eastAsia="Arial"/>
+      <w:color w:val="000000"/>
     </w:rPr>
     <w:tblPr>
       <w:tblStyleRowBandSize w:val="1"/>
@@ -6941,8 +7377,8 @@
       <w:spacing w:after="0" w:line="240" w:lineRule="auto"/>
     </w:pPr>
     <w:rPr>
-      <w:rFonts w:asciiTheme="majorHAnsi" w:eastAsiaTheme="majorEastAsia" w:hAnsiTheme="majorHAnsi" w:cstheme="majorBidi"/>
-      <w:color w:val="000000" w:themeColor="text1"/>
+      <w:rFonts w:asciiTheme="majorHAnsi" w:eastAsiaTheme="majorEastAsia" w:hAnsiTheme="majorHAnsi" w:cstheme="majorBidi" w:ascii="Arial" w:hAnsi="Arial" w:eastAsia="Arial"/>
+      <w:color w:val="000000"/>
     </w:rPr>
     <w:tblPr>
       <w:tblStyleRowBandSize w:val="1"/>
@@ -7069,8 +7505,8 @@
       <w:spacing w:after="0" w:line="240" w:lineRule="auto"/>
     </w:pPr>
     <w:rPr>
-      <w:rFonts w:asciiTheme="majorHAnsi" w:eastAsiaTheme="majorEastAsia" w:hAnsiTheme="majorHAnsi" w:cstheme="majorBidi"/>
-      <w:color w:val="000000" w:themeColor="text1"/>
+      <w:rFonts w:asciiTheme="majorHAnsi" w:eastAsiaTheme="majorEastAsia" w:hAnsiTheme="majorHAnsi" w:cstheme="majorBidi" w:ascii="Arial" w:hAnsi="Arial" w:eastAsia="Arial"/>
+      <w:color w:val="000000"/>
     </w:rPr>
     <w:tblPr>
       <w:tblStyleRowBandSize w:val="1"/>
@@ -7196,6 +7632,10 @@
     <w:pPr>
       <w:spacing w:after="0" w:line="240" w:lineRule="auto"/>
     </w:pPr>
+    <w:rPr>
+      <w:rFonts w:ascii="Arial" w:hAnsi="Arial" w:eastAsia="Arial"/>
+      <w:color w:val="000000"/>
+    </w:rPr>
     <w:tblPr>
       <w:tblStyleRowBandSize w:val="1"/>
       <w:tblStyleColBandSize w:val="1"/>
@@ -7269,6 +7709,10 @@
     <w:pPr>
       <w:spacing w:after="0" w:line="240" w:lineRule="auto"/>
     </w:pPr>
+    <w:rPr>
+      <w:rFonts w:ascii="Arial" w:hAnsi="Arial" w:eastAsia="Arial"/>
+      <w:color w:val="000000"/>
+    </w:rPr>
     <w:tblPr>
       <w:tblStyleRowBandSize w:val="1"/>
       <w:tblStyleColBandSize w:val="1"/>
@@ -7342,6 +7786,10 @@
     <w:pPr>
       <w:spacing w:after="0" w:line="240" w:lineRule="auto"/>
     </w:pPr>
+    <w:rPr>
+      <w:rFonts w:ascii="Arial" w:hAnsi="Arial" w:eastAsia="Arial"/>
+      <w:color w:val="000000"/>
+    </w:rPr>
     <w:tblPr>
       <w:tblStyleRowBandSize w:val="1"/>
       <w:tblStyleColBandSize w:val="1"/>
@@ -7415,6 +7863,10 @@
     <w:pPr>
       <w:spacing w:after="0" w:line="240" w:lineRule="auto"/>
     </w:pPr>
+    <w:rPr>
+      <w:rFonts w:ascii="Arial" w:hAnsi="Arial" w:eastAsia="Arial"/>
+      <w:color w:val="000000"/>
+    </w:rPr>
     <w:tblPr>
       <w:tblStyleRowBandSize w:val="1"/>
       <w:tblStyleColBandSize w:val="1"/>
@@ -7488,6 +7940,10 @@
     <w:pPr>
       <w:spacing w:after="0" w:line="240" w:lineRule="auto"/>
     </w:pPr>
+    <w:rPr>
+      <w:rFonts w:ascii="Arial" w:hAnsi="Arial" w:eastAsia="Arial"/>
+      <w:color w:val="000000"/>
+    </w:rPr>
     <w:tblPr>
       <w:tblStyleRowBandSize w:val="1"/>
       <w:tblStyleColBandSize w:val="1"/>
@@ -7561,6 +8017,10 @@
     <w:pPr>
       <w:spacing w:after="0" w:line="240" w:lineRule="auto"/>
     </w:pPr>
+    <w:rPr>
+      <w:rFonts w:ascii="Arial" w:hAnsi="Arial" w:eastAsia="Arial"/>
+      <w:color w:val="000000"/>
+    </w:rPr>
     <w:tblPr>
       <w:tblStyleRowBandSize w:val="1"/>
       <w:tblStyleColBandSize w:val="1"/>
@@ -7634,6 +8094,10 @@
     <w:pPr>
       <w:spacing w:after="0" w:line="240" w:lineRule="auto"/>
     </w:pPr>
+    <w:rPr>
+      <w:rFonts w:ascii="Arial" w:hAnsi="Arial" w:eastAsia="Arial"/>
+      <w:color w:val="000000"/>
+    </w:rPr>
     <w:tblPr>
       <w:tblStyleRowBandSize w:val="1"/>
       <w:tblStyleColBandSize w:val="1"/>
@@ -7708,8 +8172,8 @@
       <w:spacing w:after="0" w:line="240" w:lineRule="auto"/>
     </w:pPr>
     <w:rPr>
-      <w:rFonts w:asciiTheme="majorHAnsi" w:eastAsiaTheme="majorEastAsia" w:hAnsiTheme="majorHAnsi" w:cstheme="majorBidi"/>
-      <w:color w:val="000000" w:themeColor="text1"/>
+      <w:rFonts w:asciiTheme="majorHAnsi" w:eastAsiaTheme="majorEastAsia" w:hAnsiTheme="majorHAnsi" w:cstheme="majorBidi" w:ascii="Arial" w:hAnsi="Arial" w:eastAsia="Arial"/>
+      <w:color w:val="000000"/>
     </w:rPr>
     <w:tblPr>
       <w:tblStyleRowBandSize w:val="1"/>
@@ -7833,8 +8297,8 @@
       <w:spacing w:after="0" w:line="240" w:lineRule="auto"/>
     </w:pPr>
     <w:rPr>
-      <w:rFonts w:asciiTheme="majorHAnsi" w:eastAsiaTheme="majorEastAsia" w:hAnsiTheme="majorHAnsi" w:cstheme="majorBidi"/>
-      <w:color w:val="000000" w:themeColor="text1"/>
+      <w:rFonts w:asciiTheme="majorHAnsi" w:eastAsiaTheme="majorEastAsia" w:hAnsiTheme="majorHAnsi" w:cstheme="majorBidi" w:ascii="Arial" w:hAnsi="Arial" w:eastAsia="Arial"/>
+      <w:color w:val="000000"/>
     </w:rPr>
     <w:tblPr>
       <w:tblStyleRowBandSize w:val="1"/>
@@ -7958,8 +8422,8 @@
       <w:spacing w:after="0" w:line="240" w:lineRule="auto"/>
     </w:pPr>
     <w:rPr>
-      <w:rFonts w:asciiTheme="majorHAnsi" w:eastAsiaTheme="majorEastAsia" w:hAnsiTheme="majorHAnsi" w:cstheme="majorBidi"/>
-      <w:color w:val="000000" w:themeColor="text1"/>
+      <w:rFonts w:asciiTheme="majorHAnsi" w:eastAsiaTheme="majorEastAsia" w:hAnsiTheme="majorHAnsi" w:cstheme="majorBidi" w:ascii="Arial" w:hAnsi="Arial" w:eastAsia="Arial"/>
+      <w:color w:val="000000"/>
     </w:rPr>
     <w:tblPr>
       <w:tblStyleRowBandSize w:val="1"/>
@@ -8083,8 +8547,8 @@
       <w:spacing w:after="0" w:line="240" w:lineRule="auto"/>
     </w:pPr>
     <w:rPr>
-      <w:rFonts w:asciiTheme="majorHAnsi" w:eastAsiaTheme="majorEastAsia" w:hAnsiTheme="majorHAnsi" w:cstheme="majorBidi"/>
-      <w:color w:val="000000" w:themeColor="text1"/>
+      <w:rFonts w:asciiTheme="majorHAnsi" w:eastAsiaTheme="majorEastAsia" w:hAnsiTheme="majorHAnsi" w:cstheme="majorBidi" w:ascii="Arial" w:hAnsi="Arial" w:eastAsia="Arial"/>
+      <w:color w:val="000000"/>
     </w:rPr>
     <w:tblPr>
       <w:tblStyleRowBandSize w:val="1"/>
@@ -8208,8 +8672,8 @@
       <w:spacing w:after="0" w:line="240" w:lineRule="auto"/>
     </w:pPr>
     <w:rPr>
-      <w:rFonts w:asciiTheme="majorHAnsi" w:eastAsiaTheme="majorEastAsia" w:hAnsiTheme="majorHAnsi" w:cstheme="majorBidi"/>
-      <w:color w:val="000000" w:themeColor="text1"/>
+      <w:rFonts w:asciiTheme="majorHAnsi" w:eastAsiaTheme="majorEastAsia" w:hAnsiTheme="majorHAnsi" w:cstheme="majorBidi" w:ascii="Arial" w:hAnsi="Arial" w:eastAsia="Arial"/>
+      <w:color w:val="000000"/>
     </w:rPr>
     <w:tblPr>
       <w:tblStyleRowBandSize w:val="1"/>
@@ -8333,8 +8797,8 @@
       <w:spacing w:after="0" w:line="240" w:lineRule="auto"/>
     </w:pPr>
     <w:rPr>
-      <w:rFonts w:asciiTheme="majorHAnsi" w:eastAsiaTheme="majorEastAsia" w:hAnsiTheme="majorHAnsi" w:cstheme="majorBidi"/>
-      <w:color w:val="000000" w:themeColor="text1"/>
+      <w:rFonts w:asciiTheme="majorHAnsi" w:eastAsiaTheme="majorEastAsia" w:hAnsiTheme="majorHAnsi" w:cstheme="majorBidi" w:ascii="Arial" w:hAnsi="Arial" w:eastAsia="Arial"/>
+      <w:color w:val="000000"/>
     </w:rPr>
     <w:tblPr>
       <w:tblStyleRowBandSize w:val="1"/>
@@ -8458,8 +8922,8 @@
       <w:spacing w:after="0" w:line="240" w:lineRule="auto"/>
     </w:pPr>
     <w:rPr>
-      <w:rFonts w:asciiTheme="majorHAnsi" w:eastAsiaTheme="majorEastAsia" w:hAnsiTheme="majorHAnsi" w:cstheme="majorBidi"/>
-      <w:color w:val="000000" w:themeColor="text1"/>
+      <w:rFonts w:asciiTheme="majorHAnsi" w:eastAsiaTheme="majorEastAsia" w:hAnsiTheme="majorHAnsi" w:cstheme="majorBidi" w:ascii="Arial" w:hAnsi="Arial" w:eastAsia="Arial"/>
+      <w:color w:val="000000"/>
     </w:rPr>
     <w:tblPr>
       <w:tblStyleRowBandSize w:val="1"/>
@@ -8582,6 +9046,10 @@
     <w:pPr>
       <w:spacing w:after="0" w:line="240" w:lineRule="auto"/>
     </w:pPr>
+    <w:rPr>
+      <w:rFonts w:ascii="Arial" w:hAnsi="Arial" w:eastAsia="Arial"/>
+      <w:color w:val="000000"/>
+    </w:rPr>
     <w:tblPr>
       <w:tblStyleRowBandSize w:val="1"/>
       <w:tblStyleColBandSize w:val="1"/>
@@ -8723,6 +9191,10 @@
     <w:pPr>
       <w:spacing w:after="0" w:line="240" w:lineRule="auto"/>
     </w:pPr>
+    <w:rPr>
+      <w:rFonts w:ascii="Arial" w:hAnsi="Arial" w:eastAsia="Arial"/>
+      <w:color w:val="000000"/>
+    </w:rPr>
     <w:tblPr>
       <w:tblStyleRowBandSize w:val="1"/>
       <w:tblStyleColBandSize w:val="1"/>
@@ -8864,6 +9336,10 @@
     <w:pPr>
       <w:spacing w:after="0" w:line="240" w:lineRule="auto"/>
     </w:pPr>
+    <w:rPr>
+      <w:rFonts w:ascii="Arial" w:hAnsi="Arial" w:eastAsia="Arial"/>
+      <w:color w:val="000000"/>
+    </w:rPr>
     <w:tblPr>
       <w:tblStyleRowBandSize w:val="1"/>
       <w:tblStyleColBandSize w:val="1"/>
@@ -9005,6 +9481,10 @@
     <w:pPr>
       <w:spacing w:after="0" w:line="240" w:lineRule="auto"/>
     </w:pPr>
+    <w:rPr>
+      <w:rFonts w:ascii="Arial" w:hAnsi="Arial" w:eastAsia="Arial"/>
+      <w:color w:val="000000"/>
+    </w:rPr>
     <w:tblPr>
       <w:tblStyleRowBandSize w:val="1"/>
       <w:tblStyleColBandSize w:val="1"/>
@@ -9146,6 +9626,10 @@
     <w:pPr>
       <w:spacing w:after="0" w:line="240" w:lineRule="auto"/>
     </w:pPr>
+    <w:rPr>
+      <w:rFonts w:ascii="Arial" w:hAnsi="Arial" w:eastAsia="Arial"/>
+      <w:color w:val="000000"/>
+    </w:rPr>
     <w:tblPr>
       <w:tblStyleRowBandSize w:val="1"/>
       <w:tblStyleColBandSize w:val="1"/>
@@ -9287,6 +9771,10 @@
     <w:pPr>
       <w:spacing w:after="0" w:line="240" w:lineRule="auto"/>
     </w:pPr>
+    <w:rPr>
+      <w:rFonts w:ascii="Arial" w:hAnsi="Arial" w:eastAsia="Arial"/>
+      <w:color w:val="000000"/>
+    </w:rPr>
     <w:tblPr>
       <w:tblStyleRowBandSize w:val="1"/>
       <w:tblStyleColBandSize w:val="1"/>
@@ -9428,6 +9916,10 @@
     <w:pPr>
       <w:spacing w:after="0" w:line="240" w:lineRule="auto"/>
     </w:pPr>
+    <w:rPr>
+      <w:rFonts w:ascii="Arial" w:hAnsi="Arial" w:eastAsia="Arial"/>
+      <w:color w:val="000000"/>
+    </w:rPr>
     <w:tblPr>
       <w:tblStyleRowBandSize w:val="1"/>
       <w:tblStyleColBandSize w:val="1"/>
@@ -9570,7 +10062,8 @@
       <w:spacing w:after="0" w:line="240" w:lineRule="auto"/>
     </w:pPr>
     <w:rPr>
-      <w:color w:val="FFFFFF" w:themeColor="background1"/>
+      <w:rFonts w:ascii="Arial" w:hAnsi="Arial" w:eastAsia="Arial"/>
+      <w:color w:val="000000"/>
     </w:rPr>
     <w:tblPr>
       <w:tblStyleRowBandSize w:val="1"/>
@@ -9684,7 +10177,8 @@
       <w:spacing w:after="0" w:line="240" w:lineRule="auto"/>
     </w:pPr>
     <w:rPr>
-      <w:color w:val="FFFFFF" w:themeColor="background1"/>
+      <w:rFonts w:ascii="Arial" w:hAnsi="Arial" w:eastAsia="Arial"/>
+      <w:color w:val="000000"/>
     </w:rPr>
     <w:tblPr>
       <w:tblStyleRowBandSize w:val="1"/>
@@ -9798,7 +10292,8 @@
       <w:spacing w:after="0" w:line="240" w:lineRule="auto"/>
     </w:pPr>
     <w:rPr>
-      <w:color w:val="FFFFFF" w:themeColor="background1"/>
+      <w:rFonts w:ascii="Arial" w:hAnsi="Arial" w:eastAsia="Arial"/>
+      <w:color w:val="000000"/>
     </w:rPr>
     <w:tblPr>
       <w:tblStyleRowBandSize w:val="1"/>
@@ -9912,7 +10407,8 @@
       <w:spacing w:after="0" w:line="240" w:lineRule="auto"/>
     </w:pPr>
     <w:rPr>
-      <w:color w:val="FFFFFF" w:themeColor="background1"/>
+      <w:rFonts w:ascii="Arial" w:hAnsi="Arial" w:eastAsia="Arial"/>
+      <w:color w:val="000000"/>
     </w:rPr>
     <w:tblPr>
       <w:tblStyleRowBandSize w:val="1"/>
@@ -10026,7 +10522,8 @@
       <w:spacing w:after="0" w:line="240" w:lineRule="auto"/>
     </w:pPr>
     <w:rPr>
-      <w:color w:val="FFFFFF" w:themeColor="background1"/>
+      <w:rFonts w:ascii="Arial" w:hAnsi="Arial" w:eastAsia="Arial"/>
+      <w:color w:val="000000"/>
     </w:rPr>
     <w:tblPr>
       <w:tblStyleRowBandSize w:val="1"/>
@@ -10140,7 +10637,8 @@
       <w:spacing w:after="0" w:line="240" w:lineRule="auto"/>
     </w:pPr>
     <w:rPr>
-      <w:color w:val="FFFFFF" w:themeColor="background1"/>
+      <w:rFonts w:ascii="Arial" w:hAnsi="Arial" w:eastAsia="Arial"/>
+      <w:color w:val="000000"/>
     </w:rPr>
     <w:tblPr>
       <w:tblStyleRowBandSize w:val="1"/>
@@ -10254,7 +10752,8 @@
       <w:spacing w:after="0" w:line="240" w:lineRule="auto"/>
     </w:pPr>
     <w:rPr>
-      <w:color w:val="FFFFFF" w:themeColor="background1"/>
+      <w:rFonts w:ascii="Arial" w:hAnsi="Arial" w:eastAsia="Arial"/>
+      <w:color w:val="000000"/>
     </w:rPr>
     <w:tblPr>
       <w:tblStyleRowBandSize w:val="1"/>
@@ -10368,7 +10867,8 @@
       <w:spacing w:after="0" w:line="240" w:lineRule="auto"/>
     </w:pPr>
     <w:rPr>
-      <w:color w:val="000000" w:themeColor="text1"/>
+      <w:rFonts w:ascii="Arial" w:hAnsi="Arial" w:eastAsia="Arial"/>
+      <w:color w:val="000000"/>
     </w:rPr>
     <w:tblPr>
       <w:tblStyleRowBandSize w:val="1"/>
@@ -10490,7 +10990,8 @@
       <w:spacing w:after="0" w:line="240" w:lineRule="auto"/>
     </w:pPr>
     <w:rPr>
-      <w:color w:val="000000" w:themeColor="text1"/>
+      <w:rFonts w:ascii="Arial" w:hAnsi="Arial" w:eastAsia="Arial"/>
+      <w:color w:val="000000"/>
     </w:rPr>
     <w:tblPr>
       <w:tblStyleRowBandSize w:val="1"/>
@@ -10612,7 +11113,8 @@
       <w:spacing w:after="0" w:line="240" w:lineRule="auto"/>
     </w:pPr>
     <w:rPr>
-      <w:color w:val="000000" w:themeColor="text1"/>
+      <w:rFonts w:ascii="Arial" w:hAnsi="Arial" w:eastAsia="Arial"/>
+      <w:color w:val="000000"/>
     </w:rPr>
     <w:tblPr>
       <w:tblStyleRowBandSize w:val="1"/>
@@ -10734,7 +11236,8 @@
       <w:spacing w:after="0" w:line="240" w:lineRule="auto"/>
     </w:pPr>
     <w:rPr>
-      <w:color w:val="000000" w:themeColor="text1"/>
+      <w:rFonts w:ascii="Arial" w:hAnsi="Arial" w:eastAsia="Arial"/>
+      <w:color w:val="000000"/>
     </w:rPr>
     <w:tblPr>
       <w:tblStyleRowBandSize w:val="1"/>
@@ -10846,7 +11349,8 @@
       <w:spacing w:after="0" w:line="240" w:lineRule="auto"/>
     </w:pPr>
     <w:rPr>
-      <w:color w:val="000000" w:themeColor="text1"/>
+      <w:rFonts w:ascii="Arial" w:hAnsi="Arial" w:eastAsia="Arial"/>
+      <w:color w:val="000000"/>
     </w:rPr>
     <w:tblPr>
       <w:tblStyleRowBandSize w:val="1"/>
@@ -10968,7 +11472,8 @@
       <w:spacing w:after="0" w:line="240" w:lineRule="auto"/>
     </w:pPr>
     <w:rPr>
-      <w:color w:val="000000" w:themeColor="text1"/>
+      <w:rFonts w:ascii="Arial" w:hAnsi="Arial" w:eastAsia="Arial"/>
+      <w:color w:val="000000"/>
     </w:rPr>
     <w:tblPr>
       <w:tblStyleRowBandSize w:val="1"/>
@@ -11090,7 +11595,8 @@
       <w:spacing w:after="0" w:line="240" w:lineRule="auto"/>
     </w:pPr>
     <w:rPr>
-      <w:color w:val="000000" w:themeColor="text1"/>
+      <w:rFonts w:ascii="Arial" w:hAnsi="Arial" w:eastAsia="Arial"/>
+      <w:color w:val="000000"/>
     </w:rPr>
     <w:tblPr>
       <w:tblStyleRowBandSize w:val="1"/>
@@ -11212,7 +11718,8 @@
       <w:spacing w:after="0" w:line="240" w:lineRule="auto"/>
     </w:pPr>
     <w:rPr>
-      <w:color w:val="000000" w:themeColor="text1"/>
+      <w:rFonts w:ascii="Arial" w:hAnsi="Arial" w:eastAsia="Arial"/>
+      <w:color w:val="000000"/>
     </w:rPr>
     <w:tblPr>
       <w:tblStyleRowBandSize w:val="1"/>
@@ -11298,7 +11805,8 @@
       <w:spacing w:after="0" w:line="240" w:lineRule="auto"/>
     </w:pPr>
     <w:rPr>
-      <w:color w:val="000000" w:themeColor="text1"/>
+      <w:rFonts w:ascii="Arial" w:hAnsi="Arial" w:eastAsia="Arial"/>
+      <w:color w:val="000000"/>
     </w:rPr>
     <w:tblPr>
       <w:tblStyleRowBandSize w:val="1"/>
@@ -11384,7 +11892,8 @@
       <w:spacing w:after="0" w:line="240" w:lineRule="auto"/>
     </w:pPr>
     <w:rPr>
-      <w:color w:val="000000" w:themeColor="text1"/>
+      <w:rFonts w:ascii="Arial" w:hAnsi="Arial" w:eastAsia="Arial"/>
+      <w:color w:val="000000"/>
     </w:rPr>
     <w:tblPr>
       <w:tblStyleRowBandSize w:val="1"/>
@@ -11470,7 +11979,8 @@
       <w:spacing w:after="0" w:line="240" w:lineRule="auto"/>
     </w:pPr>
     <w:rPr>
-      <w:color w:val="000000" w:themeColor="text1"/>
+      <w:rFonts w:ascii="Arial" w:hAnsi="Arial" w:eastAsia="Arial"/>
+      <w:color w:val="000000"/>
     </w:rPr>
     <w:tblPr>
       <w:tblStyleRowBandSize w:val="1"/>
@@ -11556,7 +12066,8 @@
       <w:spacing w:after="0" w:line="240" w:lineRule="auto"/>
     </w:pPr>
     <w:rPr>
-      <w:color w:val="000000" w:themeColor="text1"/>
+      <w:rFonts w:ascii="Arial" w:hAnsi="Arial" w:eastAsia="Arial"/>
+      <w:color w:val="000000"/>
     </w:rPr>
     <w:tblPr>
       <w:tblStyleRowBandSize w:val="1"/>
@@ -11642,7 +12153,8 @@
       <w:spacing w:after="0" w:line="240" w:lineRule="auto"/>
     </w:pPr>
     <w:rPr>
-      <w:color w:val="000000" w:themeColor="text1"/>
+      <w:rFonts w:ascii="Arial" w:hAnsi="Arial" w:eastAsia="Arial"/>
+      <w:color w:val="000000"/>
     </w:rPr>
     <w:tblPr>
       <w:tblStyleRowBandSize w:val="1"/>
@@ -11728,7 +12240,8 @@
       <w:spacing w:after="0" w:line="240" w:lineRule="auto"/>
     </w:pPr>
     <w:rPr>
-      <w:color w:val="000000" w:themeColor="text1"/>
+      <w:rFonts w:ascii="Arial" w:hAnsi="Arial" w:eastAsia="Arial"/>
+      <w:color w:val="000000"/>
     </w:rPr>
     <w:tblPr>
       <w:tblStyleRowBandSize w:val="1"/>
@@ -11814,7 +12327,8 @@
       <w:spacing w:after="0" w:line="240" w:lineRule="auto"/>
     </w:pPr>
     <w:rPr>
-      <w:color w:val="000000" w:themeColor="text1"/>
+      <w:rFonts w:ascii="Arial" w:hAnsi="Arial" w:eastAsia="Arial"/>
+      <w:color w:val="000000"/>
     </w:rPr>
     <w:tblPr>
       <w:tblStyleRowBandSize w:val="1"/>
@@ -11894,7 +12408,8 @@
       <w:spacing w:after="0" w:line="240" w:lineRule="auto"/>
     </w:pPr>
     <w:rPr>
-      <w:color w:val="000000" w:themeColor="text1"/>
+      <w:rFonts w:ascii="Arial" w:hAnsi="Arial" w:eastAsia="Arial"/>
+      <w:color w:val="000000"/>
     </w:rPr>
     <w:tblPr>
       <w:tblStyleRowBandSize w:val="1"/>
@@ -11974,7 +12489,8 @@
       <w:spacing w:after="0" w:line="240" w:lineRule="auto"/>
     </w:pPr>
     <w:rPr>
-      <w:color w:val="000000" w:themeColor="text1"/>
+      <w:rFonts w:ascii="Arial" w:hAnsi="Arial" w:eastAsia="Arial"/>
+      <w:color w:val="000000"/>
     </w:rPr>
     <w:tblPr>
       <w:tblStyleRowBandSize w:val="1"/>
@@ -12054,7 +12570,8 @@
       <w:spacing w:after="0" w:line="240" w:lineRule="auto"/>
     </w:pPr>
     <w:rPr>
-      <w:color w:val="000000" w:themeColor="text1"/>
+      <w:rFonts w:ascii="Arial" w:hAnsi="Arial" w:eastAsia="Arial"/>
+      <w:color w:val="000000"/>
     </w:rPr>
     <w:tblPr>
       <w:tblStyleRowBandSize w:val="1"/>
@@ -12134,7 +12651,8 @@
       <w:spacing w:after="0" w:line="240" w:lineRule="auto"/>
     </w:pPr>
     <w:rPr>
-      <w:color w:val="000000" w:themeColor="text1"/>
+      <w:rFonts w:ascii="Arial" w:hAnsi="Arial" w:eastAsia="Arial"/>
+      <w:color w:val="000000"/>
     </w:rPr>
     <w:tblPr>
       <w:tblStyleRowBandSize w:val="1"/>
@@ -12214,7 +12732,8 @@
       <w:spacing w:after="0" w:line="240" w:lineRule="auto"/>
     </w:pPr>
     <w:rPr>
-      <w:color w:val="000000" w:themeColor="text1"/>
+      <w:rFonts w:ascii="Arial" w:hAnsi="Arial" w:eastAsia="Arial"/>
+      <w:color w:val="000000"/>
     </w:rPr>
     <w:tblPr>
       <w:tblStyleRowBandSize w:val="1"/>
@@ -12294,7 +12813,8 @@
       <w:spacing w:after="0" w:line="240" w:lineRule="auto"/>
     </w:pPr>
     <w:rPr>
-      <w:color w:val="000000" w:themeColor="text1"/>
+      <w:rFonts w:ascii="Arial" w:hAnsi="Arial" w:eastAsia="Arial"/>
+      <w:color w:val="000000"/>
     </w:rPr>
     <w:tblPr>
       <w:tblStyleRowBandSize w:val="1"/>

</xml_diff>